<commit_message>
docs: agregar informe en formato PDF
</commit_message>
<xml_diff>
--- a/ACTIVIDAD_3_HELPDESK_HTML/MAURO_POMAGUALLI_ACTIVIDAD_3.docx
+++ b/ACTIVIDAD_3_HELPDESK_HTML/MAURO_POMAGUALLI_ACTIVIDAD_3.docx
@@ -2801,7 +2801,7 @@
           <w:rFonts w:ascii="Arial" w:hAnsi="Arial" w:cs="Arial"/>
           <w:b/>
           <w:bCs/>
-          <w:lang w:eastAsia="es-EC"/>
+          <w:lang w:val="en-US" w:eastAsia="es-EC"/>
         </w:rPr>
       </w:pPr>
     </w:p>
@@ -2815,7 +2815,7 @@
           <w:rFonts w:ascii="Arial" w:hAnsi="Arial" w:cs="Arial"/>
           <w:b/>
           <w:bCs/>
-          <w:lang w:eastAsia="es-EC"/>
+          <w:lang w:val="en-US" w:eastAsia="es-EC"/>
         </w:rPr>
       </w:pPr>
     </w:p>
@@ -2829,7 +2829,7 @@
           <w:rFonts w:ascii="Arial" w:hAnsi="Arial" w:cs="Arial"/>
           <w:b/>
           <w:bCs/>
-          <w:lang w:eastAsia="es-EC"/>
+          <w:lang w:val="en-US" w:eastAsia="es-EC"/>
         </w:rPr>
       </w:pPr>
     </w:p>
@@ -2843,7 +2843,7 @@
           <w:rFonts w:ascii="Arial" w:hAnsi="Arial" w:cs="Arial"/>
           <w:b/>
           <w:bCs/>
-          <w:lang w:eastAsia="es-EC"/>
+          <w:lang w:val="en-US" w:eastAsia="es-EC"/>
         </w:rPr>
       </w:pPr>
     </w:p>
@@ -2857,7 +2857,7 @@
           <w:rFonts w:ascii="Arial" w:hAnsi="Arial" w:cs="Arial"/>
           <w:b/>
           <w:bCs/>
-          <w:lang w:eastAsia="es-EC"/>
+          <w:lang w:val="en-US" w:eastAsia="es-EC"/>
         </w:rPr>
       </w:pPr>
     </w:p>
@@ -2871,7 +2871,7 @@
           <w:rFonts w:ascii="Arial" w:hAnsi="Arial" w:cs="Arial"/>
           <w:b/>
           <w:bCs/>
-          <w:lang w:eastAsia="es-EC"/>
+          <w:lang w:val="en-US" w:eastAsia="es-EC"/>
         </w:rPr>
       </w:pPr>
     </w:p>
@@ -2883,16 +2883,12 @@
         <w:jc w:val="both"/>
         <w:rPr>
           <w:rFonts w:ascii="Arial" w:hAnsi="Arial" w:cs="Arial"/>
-          <w:b/>
-          <w:bCs/>
           <w:lang w:val="es-ES" w:eastAsia="es-EC"/>
         </w:rPr>
       </w:pPr>
       <w:r>
         <w:rPr>
           <w:rFonts w:ascii="Arial" w:hAnsi="Arial" w:cs="Arial"/>
-          <w:b/>
-          <w:bCs/>
           <w:noProof/>
           <w:lang w:eastAsia="es-EC"/>
         </w:rPr>
@@ -2900,7 +2896,7 @@
         <mc:AlternateContent>
           <mc:Choice Requires="wps">
             <w:drawing>
-              <wp:anchor distT="0" distB="0" distL="114300" distR="114300" simplePos="0" relativeHeight="251674624" behindDoc="0" locked="0" layoutInCell="1" allowOverlap="1" wp14:anchorId="01087A68" wp14:editId="2BF2AE48">
+              <wp:anchor distT="0" distB="0" distL="114300" distR="114300" simplePos="0" relativeHeight="251674624" behindDoc="0" locked="0" layoutInCell="1" allowOverlap="1" wp14:anchorId="01087A68" wp14:editId="2B0E7E51">
                 <wp:simplePos x="0" y="0"/>
                 <wp:positionH relativeFrom="column">
                   <wp:posOffset>-86604</wp:posOffset>
@@ -2966,7 +2962,7 @@
           </mc:Choice>
           <mc:Fallback>
             <w:pict>
-              <v:rect w14:anchorId="0747513F" id="Rectángulo 14" o:spid="_x0000_s1026" style="position:absolute;margin-left:-6.8pt;margin-top:127.25pt;width:443.1pt;height:109.4pt;z-index:251674624;visibility:visible;mso-wrap-style:square;mso-width-percent:0;mso-wrap-distance-left:9pt;mso-wrap-distance-top:0;mso-wrap-distance-right:9pt;mso-wrap-distance-bottom:0;mso-position-horizontal:absolute;mso-position-horizontal-relative:text;mso-position-vertical:absolute;mso-position-vertical-relative:text;mso-width-percent:0;mso-width-relative:margin;v-text-anchor:middle" o:gfxdata="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" filled="f" strokecolor="red" strokeweight="1.5pt">
+              <v:rect w14:anchorId="61980AED" id="Rectángulo 14" o:spid="_x0000_s1026" style="position:absolute;margin-left:-6.8pt;margin-top:127.25pt;width:443.1pt;height:109.4pt;z-index:251674624;visibility:visible;mso-wrap-style:square;mso-width-percent:0;mso-wrap-distance-left:9pt;mso-wrap-distance-top:0;mso-wrap-distance-right:9pt;mso-wrap-distance-bottom:0;mso-position-horizontal:absolute;mso-position-horizontal-relative:text;mso-position-vertical:absolute;mso-position-vertical-relative:text;mso-width-percent:0;mso-width-relative:margin;v-text-anchor:middle" o:gfxdata="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" filled="f" strokecolor="red" strokeweight="1.5pt">
                 <v:stroke dashstyle="3 1"/>
               </v:rect>
             </w:pict>
@@ -2976,8 +2972,6 @@
       <w:r>
         <w:rPr>
           <w:rFonts w:ascii="Arial" w:hAnsi="Arial" w:cs="Arial"/>
-          <w:b/>
-          <w:bCs/>
           <w:lang w:eastAsia="es-EC"/>
         </w:rPr>
         <w:t>CREACION DE LA RAMA “</w:t>
@@ -2986,8 +2980,6 @@
       <w:r>
         <w:rPr>
           <w:rFonts w:ascii="Arial" w:hAnsi="Arial" w:cs="Arial"/>
-          <w:b/>
-          <w:bCs/>
           <w:lang w:eastAsia="es-EC"/>
         </w:rPr>
         <w:t>feature</w:t>
@@ -2996,8 +2988,6 @@
       <w:r>
         <w:rPr>
           <w:rFonts w:ascii="Arial" w:hAnsi="Arial" w:cs="Arial"/>
-          <w:b/>
-          <w:bCs/>
           <w:lang w:eastAsia="es-EC"/>
         </w:rPr>
         <w:t>/</w:t>
@@ -3006,8 +2996,6 @@
       <w:r>
         <w:rPr>
           <w:rFonts w:ascii="Arial" w:hAnsi="Arial" w:cs="Arial"/>
-          <w:b/>
-          <w:bCs/>
           <w:lang w:eastAsia="es-EC"/>
         </w:rPr>
         <w:t>maquetacion-html</w:t>
@@ -3016,8 +3004,6 @@
       <w:r>
         <w:rPr>
           <w:rFonts w:ascii="Arial" w:hAnsi="Arial" w:cs="Arial"/>
-          <w:b/>
-          <w:bCs/>
           <w:lang w:eastAsia="es-EC"/>
         </w:rPr>
         <w:t>”</w:t>
@@ -3041,10 +3027,11 @@
           <w:rFonts w:ascii="Arial" w:hAnsi="Arial" w:cs="Arial"/>
           <w:b/>
           <w:bCs/>
+          <w:noProof/>
           <w:lang w:val="en-US" w:eastAsia="es-EC"/>
         </w:rPr>
         <w:drawing>
-          <wp:anchor distT="0" distB="0" distL="114300" distR="114300" simplePos="0" relativeHeight="251673600" behindDoc="0" locked="0" layoutInCell="1" allowOverlap="1" wp14:anchorId="73DC7518" wp14:editId="65E2C6B9">
+          <wp:anchor distT="0" distB="0" distL="114300" distR="114300" simplePos="0" relativeHeight="251673600" behindDoc="0" locked="0" layoutInCell="1" allowOverlap="1" wp14:anchorId="73DC7518" wp14:editId="7E6D62C0">
             <wp:simplePos x="0" y="0"/>
             <wp:positionH relativeFrom="margin">
               <wp:align>right</wp:align>
@@ -3104,21 +3091,124 @@
       <w:r>
         <w:rPr>
           <w:rFonts w:ascii="Arial" w:hAnsi="Arial" w:cs="Arial"/>
+        </w:rPr>
+        <w:t>RE</w:t>
+      </w:r>
+      <w:r>
+        <w:rPr>
+          <w:rFonts w:ascii="Arial" w:hAnsi="Arial" w:cs="Arial"/>
+        </w:rPr>
+        <w:t>VISAMOS LOS CAMBIO PARA POSTERIOR REALIZAR</w:t>
+      </w:r>
+      <w:r>
+        <w:rPr>
+          <w:rFonts w:ascii="Arial" w:hAnsi="Arial" w:cs="Arial"/>
+        </w:rPr>
+        <w:t xml:space="preserve"> EL PRIMER COMMIT</w:t>
+      </w:r>
+    </w:p>
+    <w:p>
+      <w:pPr>
+        <w:jc w:val="both"/>
+        <w:rPr>
+          <w:rFonts w:ascii="Arial" w:hAnsi="Arial" w:cs="Arial"/>
+        </w:rPr>
+      </w:pPr>
+      <w:r>
+        <w:rPr>
+          <w:rFonts w:ascii="Arial" w:hAnsi="Arial" w:cs="Arial"/>
           <w:noProof/>
+          <w:lang w:eastAsia="es-EC"/>
+        </w:rPr>
+        <mc:AlternateContent>
+          <mc:Choice Requires="wps">
+            <w:drawing>
+              <wp:anchor distT="0" distB="0" distL="114300" distR="114300" simplePos="0" relativeHeight="251676672" behindDoc="0" locked="0" layoutInCell="1" allowOverlap="1" wp14:anchorId="619D73D8" wp14:editId="536F1C14">
+                <wp:simplePos x="0" y="0"/>
+                <wp:positionH relativeFrom="margin">
+                  <wp:align>center</wp:align>
+                </wp:positionH>
+                <wp:positionV relativeFrom="paragraph">
+                  <wp:posOffset>721573</wp:posOffset>
+                </wp:positionV>
+                <wp:extent cx="5626735" cy="1943899"/>
+                <wp:effectExtent l="0" t="0" r="12065" b="18415"/>
+                <wp:wrapNone/>
+                <wp:docPr id="24" name="Rectángulo 24"/>
+                <wp:cNvGraphicFramePr/>
+                <a:graphic xmlns:a="http://schemas.openxmlformats.org/drawingml/2006/main">
+                  <a:graphicData uri="http://schemas.microsoft.com/office/word/2010/wordprocessingShape">
+                    <wps:wsp>
+                      <wps:cNvSpPr/>
+                      <wps:spPr>
+                        <a:xfrm>
+                          <a:off x="0" y="0"/>
+                          <a:ext cx="5626735" cy="1943899"/>
+                        </a:xfrm>
+                        <a:prstGeom prst="rect">
+                          <a:avLst/>
+                        </a:prstGeom>
+                        <a:noFill/>
+                        <a:ln w="19050">
+                          <a:solidFill>
+                            <a:srgbClr val="FF0000"/>
+                          </a:solidFill>
+                          <a:prstDash val="sysDash"/>
+                        </a:ln>
+                      </wps:spPr>
+                      <wps:style>
+                        <a:lnRef idx="2">
+                          <a:schemeClr val="accent1">
+                            <a:shade val="50000"/>
+                          </a:schemeClr>
+                        </a:lnRef>
+                        <a:fillRef idx="1">
+                          <a:schemeClr val="accent1"/>
+                        </a:fillRef>
+                        <a:effectRef idx="0">
+                          <a:schemeClr val="accent1"/>
+                        </a:effectRef>
+                        <a:fontRef idx="minor">
+                          <a:schemeClr val="lt1"/>
+                        </a:fontRef>
+                      </wps:style>
+                      <wps:bodyPr rot="0" spcFirstLastPara="0" vertOverflow="overflow" horzOverflow="overflow" vert="horz" wrap="square" lIns="91440" tIns="45720" rIns="91440" bIns="45720" numCol="1" spcCol="0" rtlCol="0" fromWordArt="0" anchor="ctr" anchorCtr="0" forceAA="0" compatLnSpc="1">
+                        <a:prstTxWarp prst="textNoShape">
+                          <a:avLst/>
+                        </a:prstTxWarp>
+                        <a:noAutofit/>
+                      </wps:bodyPr>
+                    </wps:wsp>
+                  </a:graphicData>
+                </a:graphic>
+                <wp14:sizeRelH relativeFrom="margin">
+                  <wp14:pctWidth>0</wp14:pctWidth>
+                </wp14:sizeRelH>
+                <wp14:sizeRelV relativeFrom="margin">
+                  <wp14:pctHeight>0</wp14:pctHeight>
+                </wp14:sizeRelV>
+              </wp:anchor>
+            </w:drawing>
+          </mc:Choice>
+          <mc:Fallback>
+            <w:pict>
+              <v:rect w14:anchorId="01471467" id="Rectángulo 24" o:spid="_x0000_s1026" style="position:absolute;margin-left:0;margin-top:56.8pt;width:443.05pt;height:153.05pt;z-index:251676672;visibility:visible;mso-wrap-style:square;mso-width-percent:0;mso-height-percent:0;mso-wrap-distance-left:9pt;mso-wrap-distance-top:0;mso-wrap-distance-right:9pt;mso-wrap-distance-bottom:0;mso-position-horizontal:center;mso-position-horizontal-relative:margin;mso-position-vertical:absolute;mso-position-vertical-relative:text;mso-width-percent:0;mso-height-percent:0;mso-width-relative:margin;mso-height-relative:margin;v-text-anchor:middle" o:gfxdata="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" filled="f" strokecolor="red" strokeweight="1.5pt">
+                <v:stroke dashstyle="3 1"/>
+                <w10:wrap anchorx="margin"/>
+              </v:rect>
+            </w:pict>
+          </mc:Fallback>
+        </mc:AlternateContent>
+      </w:r>
+      <w:r>
+        <w:rPr>
+          <w:rFonts w:ascii="Arial" w:hAnsi="Arial" w:cs="Arial"/>
         </w:rPr>
         <w:drawing>
-          <wp:anchor distT="0" distB="0" distL="114300" distR="114300" simplePos="0" relativeHeight="251672576" behindDoc="0" locked="0" layoutInCell="1" allowOverlap="1" wp14:anchorId="3B27FD22" wp14:editId="532A4C38">
-            <wp:simplePos x="0" y="0"/>
-            <wp:positionH relativeFrom="margin">
-              <wp:align>left</wp:align>
-            </wp:positionH>
-            <wp:positionV relativeFrom="paragraph">
-              <wp:posOffset>297815</wp:posOffset>
-            </wp:positionV>
-            <wp:extent cx="5400040" cy="2413000"/>
-            <wp:effectExtent l="0" t="0" r="0" b="6350"/>
-            <wp:wrapSquare wrapText="bothSides"/>
-            <wp:docPr id="7" name="Imagen 7"/>
+          <wp:inline distT="0" distB="0" distL="0" distR="0" wp14:anchorId="53259257" wp14:editId="3E0D7B53">
+            <wp:extent cx="5400040" cy="3139440"/>
+            <wp:effectExtent l="0" t="0" r="0" b="3810"/>
+            <wp:docPr id="23" name="Imagen 23"/>
             <wp:cNvGraphicFramePr>
               <a:graphicFrameLocks xmlns:a="http://schemas.openxmlformats.org/drawingml/2006/main" noChangeAspect="1"/>
             </wp:cNvGraphicFramePr>
@@ -3129,88 +3219,357 @@
                     <pic:cNvPr id="1" name=""/>
                     <pic:cNvPicPr/>
                   </pic:nvPicPr>
-                  <pic:blipFill rotWithShape="1">
-                    <a:blip r:embed="rId28">
-                      <a:extLst>
-                        <a:ext uri="{28A0092B-C50C-407E-A947-70E740481C1C}">
-                          <a14:useLocalDpi xmlns:a14="http://schemas.microsoft.com/office/drawing/2010/main" val="0"/>
-                        </a:ext>
-                      </a:extLst>
-                    </a:blip>
-                    <a:srcRect b="22099"/>
-                    <a:stretch/>
+                  <pic:blipFill>
+                    <a:blip r:embed="rId28"/>
+                    <a:stretch>
+                      <a:fillRect/>
+                    </a:stretch>
                   </pic:blipFill>
-                  <pic:spPr bwMode="auto">
+                  <pic:spPr>
                     <a:xfrm>
                       <a:off x="0" y="0"/>
-                      <a:ext cx="5400040" cy="2413000"/>
+                      <a:ext cx="5400040" cy="3139440"/>
                     </a:xfrm>
                     <a:prstGeom prst="rect">
                       <a:avLst/>
                     </a:prstGeom>
-                    <a:ln>
-                      <a:noFill/>
-                    </a:ln>
-                    <a:extLst>
-                      <a:ext uri="{53640926-AAD7-44D8-BBD7-CCE9431645EC}">
-                        <a14:shadowObscured xmlns:a14="http://schemas.microsoft.com/office/drawing/2010/main"/>
-                      </a:ext>
-                    </a:extLst>
                   </pic:spPr>
                 </pic:pic>
               </a:graphicData>
             </a:graphic>
-            <wp14:sizeRelV relativeFrom="margin">
-              <wp14:pctHeight>0</wp14:pctHeight>
-            </wp14:sizeRelV>
-          </wp:anchor>
+          </wp:inline>
         </w:drawing>
       </w:r>
-      <w:r>
-        <w:rPr>
-          <w:rFonts w:ascii="Arial" w:hAnsi="Arial" w:cs="Arial"/>
-        </w:rPr>
-        <w:t>REALIZAMOS EL PRIMER COMMIT</w:t>
-      </w:r>
-    </w:p>
-    <w:p>
-      <w:pPr>
+    </w:p>
+    <w:p>
+      <w:pPr>
+        <w:widowControl w:val="0"/>
+        <w:pBdr>
+          <w:top w:val="nil"/>
+          <w:left w:val="nil"/>
+          <w:bottom w:val="nil"/>
+          <w:right w:val="nil"/>
+          <w:between w:val="nil"/>
+        </w:pBdr>
+        <w:spacing w:after="0" w:line="240" w:lineRule="auto"/>
         <w:jc w:val="both"/>
         <w:rPr>
-          <w:rFonts w:ascii="Arial" w:hAnsi="Arial" w:cs="Arial"/>
+          <w:rFonts w:ascii="Arial" w:eastAsiaTheme="majorEastAsia" w:hAnsi="Arial" w:cs="Arial"/>
           <w:b/>
           <w:bCs/>
-        </w:rPr>
-      </w:pPr>
-      <w:r>
-        <w:rPr>
-          <w:rFonts w:ascii="Arial" w:hAnsi="Arial" w:cs="Arial"/>
+          <w:lang w:eastAsia="es-EC"/>
+        </w:rPr>
+      </w:pPr>
+    </w:p>
+    <w:p>
+      <w:pPr>
+        <w:widowControl w:val="0"/>
+        <w:pBdr>
+          <w:top w:val="nil"/>
+          <w:left w:val="nil"/>
+          <w:bottom w:val="nil"/>
+          <w:right w:val="nil"/>
+          <w:between w:val="nil"/>
+        </w:pBdr>
+        <w:spacing w:after="0" w:line="240" w:lineRule="auto"/>
+        <w:jc w:val="both"/>
+        <w:rPr>
+          <w:rFonts w:ascii="Arial" w:eastAsiaTheme="majorEastAsia" w:hAnsi="Arial" w:cs="Arial"/>
           <w:b/>
           <w:bCs/>
-        </w:rPr>
-        <w:t>CREAMOS EL REPOSITORIO EN GITHUB</w:t>
-      </w:r>
-    </w:p>
-    <w:p>
-      <w:pPr>
+          <w:lang w:eastAsia="es-EC"/>
+        </w:rPr>
+      </w:pPr>
+    </w:p>
+    <w:p>
+      <w:pPr>
+        <w:widowControl w:val="0"/>
+        <w:pBdr>
+          <w:top w:val="nil"/>
+          <w:left w:val="nil"/>
+          <w:bottom w:val="nil"/>
+          <w:right w:val="nil"/>
+          <w:between w:val="nil"/>
+        </w:pBdr>
+        <w:spacing w:after="0" w:line="240" w:lineRule="auto"/>
         <w:jc w:val="both"/>
         <w:rPr>
-          <w:rFonts w:ascii="Arial" w:hAnsi="Arial" w:cs="Arial"/>
+          <w:rFonts w:ascii="Arial" w:eastAsiaTheme="majorEastAsia" w:hAnsi="Arial" w:cs="Arial"/>
           <w:b/>
           <w:bCs/>
+          <w:lang w:eastAsia="es-EC"/>
+        </w:rPr>
+      </w:pPr>
+    </w:p>
+    <w:p>
+      <w:pPr>
+        <w:widowControl w:val="0"/>
+        <w:pBdr>
+          <w:top w:val="nil"/>
+          <w:left w:val="nil"/>
+          <w:bottom w:val="nil"/>
+          <w:right w:val="nil"/>
+          <w:between w:val="nil"/>
+        </w:pBdr>
+        <w:spacing w:after="0" w:line="240" w:lineRule="auto"/>
+        <w:jc w:val="both"/>
+        <w:rPr>
+          <w:rFonts w:ascii="Arial" w:eastAsiaTheme="majorEastAsia" w:hAnsi="Arial" w:cs="Arial"/>
+          <w:b/>
+          <w:bCs/>
+          <w:lang w:eastAsia="es-EC"/>
+        </w:rPr>
+      </w:pPr>
+    </w:p>
+    <w:p>
+      <w:pPr>
+        <w:widowControl w:val="0"/>
+        <w:pBdr>
+          <w:top w:val="nil"/>
+          <w:left w:val="nil"/>
+          <w:bottom w:val="nil"/>
+          <w:right w:val="nil"/>
+          <w:between w:val="nil"/>
+        </w:pBdr>
+        <w:spacing w:after="0" w:line="240" w:lineRule="auto"/>
+        <w:jc w:val="both"/>
+        <w:rPr>
+          <w:rFonts w:ascii="Arial" w:eastAsiaTheme="majorEastAsia" w:hAnsi="Arial" w:cs="Arial"/>
+          <w:b/>
+          <w:bCs/>
+          <w:lang w:eastAsia="es-EC"/>
+        </w:rPr>
+      </w:pPr>
+    </w:p>
+    <w:p>
+      <w:pPr>
+        <w:widowControl w:val="0"/>
+        <w:pBdr>
+          <w:top w:val="nil"/>
+          <w:left w:val="nil"/>
+          <w:bottom w:val="nil"/>
+          <w:right w:val="nil"/>
+          <w:between w:val="nil"/>
+        </w:pBdr>
+        <w:spacing w:after="0" w:line="240" w:lineRule="auto"/>
+        <w:jc w:val="both"/>
+        <w:rPr>
+          <w:rFonts w:ascii="Arial" w:eastAsiaTheme="majorEastAsia" w:hAnsi="Arial" w:cs="Arial"/>
+          <w:b/>
+          <w:bCs/>
+          <w:lang w:eastAsia="es-EC"/>
+        </w:rPr>
+      </w:pPr>
+    </w:p>
+    <w:p>
+      <w:pPr>
+        <w:widowControl w:val="0"/>
+        <w:pBdr>
+          <w:top w:val="nil"/>
+          <w:left w:val="nil"/>
+          <w:bottom w:val="nil"/>
+          <w:right w:val="nil"/>
+          <w:between w:val="nil"/>
+        </w:pBdr>
+        <w:spacing w:after="0" w:line="240" w:lineRule="auto"/>
+        <w:jc w:val="both"/>
+        <w:rPr>
+          <w:rFonts w:ascii="Arial" w:eastAsiaTheme="majorEastAsia" w:hAnsi="Arial" w:cs="Arial"/>
+          <w:b/>
+          <w:bCs/>
+          <w:lang w:eastAsia="es-EC"/>
+        </w:rPr>
+      </w:pPr>
+    </w:p>
+    <w:p>
+      <w:pPr>
+        <w:widowControl w:val="0"/>
+        <w:pBdr>
+          <w:top w:val="nil"/>
+          <w:left w:val="nil"/>
+          <w:bottom w:val="nil"/>
+          <w:right w:val="nil"/>
+          <w:between w:val="nil"/>
+        </w:pBdr>
+        <w:spacing w:after="0" w:line="240" w:lineRule="auto"/>
+        <w:jc w:val="both"/>
+        <w:rPr>
+          <w:rFonts w:ascii="Arial" w:eastAsiaTheme="majorEastAsia" w:hAnsi="Arial" w:cs="Arial"/>
+          <w:b/>
+          <w:bCs/>
+          <w:lang w:eastAsia="es-EC"/>
+        </w:rPr>
+      </w:pPr>
+    </w:p>
+    <w:p>
+      <w:pPr>
+        <w:widowControl w:val="0"/>
+        <w:pBdr>
+          <w:top w:val="nil"/>
+          <w:left w:val="nil"/>
+          <w:bottom w:val="nil"/>
+          <w:right w:val="nil"/>
+          <w:between w:val="nil"/>
+        </w:pBdr>
+        <w:spacing w:after="0" w:line="240" w:lineRule="auto"/>
+        <w:jc w:val="both"/>
+        <w:rPr>
+          <w:rFonts w:ascii="Arial" w:eastAsiaTheme="majorEastAsia" w:hAnsi="Arial" w:cs="Arial"/>
+          <w:b/>
+          <w:bCs/>
+          <w:lang w:eastAsia="es-EC"/>
+        </w:rPr>
+      </w:pPr>
+    </w:p>
+    <w:p>
+      <w:pPr>
+        <w:widowControl w:val="0"/>
+        <w:pBdr>
+          <w:top w:val="nil"/>
+          <w:left w:val="nil"/>
+          <w:bottom w:val="nil"/>
+          <w:right w:val="nil"/>
+          <w:between w:val="nil"/>
+        </w:pBdr>
+        <w:spacing w:after="0" w:line="240" w:lineRule="auto"/>
+        <w:jc w:val="both"/>
+        <w:rPr>
+          <w:rFonts w:ascii="Arial" w:eastAsiaTheme="majorEastAsia" w:hAnsi="Arial" w:cs="Arial"/>
+          <w:b/>
+          <w:bCs/>
+          <w:lang w:eastAsia="es-EC"/>
+        </w:rPr>
+      </w:pPr>
+      <w:r>
+        <w:rPr>
+          <w:rFonts w:ascii="Arial" w:eastAsiaTheme="majorEastAsia" w:hAnsi="Arial" w:cs="Arial"/>
+          <w:b/>
+          <w:bCs/>
+          <w:lang w:eastAsia="es-EC"/>
+        </w:rPr>
+        <w:lastRenderedPageBreak/>
+        <w:t>REALIZAMOS EL COMIT PARA SUBIR LOS CAMBIOS A GITHUB</w:t>
+      </w:r>
+    </w:p>
+    <w:p>
+      <w:pPr>
+        <w:widowControl w:val="0"/>
+        <w:pBdr>
+          <w:top w:val="nil"/>
+          <w:left w:val="nil"/>
+          <w:bottom w:val="nil"/>
+          <w:right w:val="nil"/>
+          <w:between w:val="nil"/>
+        </w:pBdr>
+        <w:spacing w:after="0" w:line="240" w:lineRule="auto"/>
+        <w:jc w:val="both"/>
+        <w:rPr>
+          <w:rFonts w:ascii="Arial" w:eastAsiaTheme="majorEastAsia" w:hAnsi="Arial" w:cs="Arial"/>
+          <w:b/>
+          <w:bCs/>
+          <w:color w:val="2F5496" w:themeColor="accent1" w:themeShade="BF"/>
+          <w:lang w:val="es-ES" w:eastAsia="es-EC"/>
         </w:rPr>
       </w:pPr>
       <w:r>
         <w:rPr>
           <w:rFonts w:ascii="Arial" w:hAnsi="Arial" w:cs="Arial"/>
           <w:noProof/>
-        </w:rPr>
-        <w:lastRenderedPageBreak/>
+          <w:lang w:eastAsia="es-EC"/>
+        </w:rPr>
+        <mc:AlternateContent>
+          <mc:Choice Requires="wps">
+            <w:drawing>
+              <wp:anchor distT="0" distB="0" distL="114300" distR="114300" simplePos="0" relativeHeight="251678720" behindDoc="0" locked="0" layoutInCell="1" allowOverlap="1" wp14:anchorId="3B026B2D" wp14:editId="46D4CBE5">
+                <wp:simplePos x="0" y="0"/>
+                <wp:positionH relativeFrom="margin">
+                  <wp:posOffset>-95397</wp:posOffset>
+                </wp:positionH>
+                <wp:positionV relativeFrom="paragraph">
+                  <wp:posOffset>1097329</wp:posOffset>
+                </wp:positionV>
+                <wp:extent cx="5626735" cy="1592043"/>
+                <wp:effectExtent l="0" t="0" r="12065" b="27305"/>
+                <wp:wrapNone/>
+                <wp:docPr id="26" name="Rectángulo 26"/>
+                <wp:cNvGraphicFramePr/>
+                <a:graphic xmlns:a="http://schemas.openxmlformats.org/drawingml/2006/main">
+                  <a:graphicData uri="http://schemas.microsoft.com/office/word/2010/wordprocessingShape">
+                    <wps:wsp>
+                      <wps:cNvSpPr/>
+                      <wps:spPr>
+                        <a:xfrm>
+                          <a:off x="0" y="0"/>
+                          <a:ext cx="5626735" cy="1592043"/>
+                        </a:xfrm>
+                        <a:prstGeom prst="rect">
+                          <a:avLst/>
+                        </a:prstGeom>
+                        <a:noFill/>
+                        <a:ln w="19050">
+                          <a:solidFill>
+                            <a:srgbClr val="FF0000"/>
+                          </a:solidFill>
+                          <a:prstDash val="sysDash"/>
+                        </a:ln>
+                      </wps:spPr>
+                      <wps:style>
+                        <a:lnRef idx="2">
+                          <a:schemeClr val="accent1">
+                            <a:shade val="50000"/>
+                          </a:schemeClr>
+                        </a:lnRef>
+                        <a:fillRef idx="1">
+                          <a:schemeClr val="accent1"/>
+                        </a:fillRef>
+                        <a:effectRef idx="0">
+                          <a:schemeClr val="accent1"/>
+                        </a:effectRef>
+                        <a:fontRef idx="minor">
+                          <a:schemeClr val="lt1"/>
+                        </a:fontRef>
+                      </wps:style>
+                      <wps:bodyPr rot="0" spcFirstLastPara="0" vertOverflow="overflow" horzOverflow="overflow" vert="horz" wrap="square" lIns="91440" tIns="45720" rIns="91440" bIns="45720" numCol="1" spcCol="0" rtlCol="0" fromWordArt="0" anchor="ctr" anchorCtr="0" forceAA="0" compatLnSpc="1">
+                        <a:prstTxWarp prst="textNoShape">
+                          <a:avLst/>
+                        </a:prstTxWarp>
+                        <a:noAutofit/>
+                      </wps:bodyPr>
+                    </wps:wsp>
+                  </a:graphicData>
+                </a:graphic>
+                <wp14:sizeRelH relativeFrom="margin">
+                  <wp14:pctWidth>0</wp14:pctWidth>
+                </wp14:sizeRelH>
+                <wp14:sizeRelV relativeFrom="margin">
+                  <wp14:pctHeight>0</wp14:pctHeight>
+                </wp14:sizeRelV>
+              </wp:anchor>
+            </w:drawing>
+          </mc:Choice>
+          <mc:Fallback>
+            <w:pict>
+              <v:rect w14:anchorId="00E7A550" id="Rectángulo 26" o:spid="_x0000_s1026" style="position:absolute;margin-left:-7.5pt;margin-top:86.4pt;width:443.05pt;height:125.35pt;z-index:251678720;visibility:visible;mso-wrap-style:square;mso-width-percent:0;mso-height-percent:0;mso-wrap-distance-left:9pt;mso-wrap-distance-top:0;mso-wrap-distance-right:9pt;mso-wrap-distance-bottom:0;mso-position-horizontal:absolute;mso-position-horizontal-relative:margin;mso-position-vertical:absolute;mso-position-vertical-relative:text;mso-width-percent:0;mso-height-percent:0;mso-width-relative:margin;mso-height-relative:margin;v-text-anchor:middle" o:gfxdata="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" filled="f" strokecolor="red" strokeweight="1.5pt">
+                <v:stroke dashstyle="3 1"/>
+                <w10:wrap anchorx="margin"/>
+              </v:rect>
+            </w:pict>
+          </mc:Fallback>
+        </mc:AlternateContent>
+      </w:r>
+      <w:r>
+        <w:rPr>
+          <w:rFonts w:ascii="Arial" w:eastAsiaTheme="majorEastAsia" w:hAnsi="Arial" w:cs="Arial"/>
+          <w:b/>
+          <w:bCs/>
+          <w:color w:val="2F5496" w:themeColor="accent1" w:themeShade="BF"/>
+          <w:lang w:val="es-ES" w:eastAsia="es-EC"/>
+        </w:rPr>
         <w:drawing>
-          <wp:inline distT="0" distB="0" distL="0" distR="0" wp14:anchorId="4EC58D9B" wp14:editId="71A0D49C">
-            <wp:extent cx="5398633" cy="2127250"/>
-            <wp:effectExtent l="0" t="0" r="0" b="6350"/>
-            <wp:docPr id="8" name="Imagen 8"/>
+          <wp:inline distT="0" distB="0" distL="0" distR="0" wp14:anchorId="3DDDB91A" wp14:editId="64EDF95B">
+            <wp:extent cx="5400040" cy="3089275"/>
+            <wp:effectExtent l="0" t="0" r="0" b="0"/>
+            <wp:docPr id="25" name="Imagen 25"/>
             <wp:cNvGraphicFramePr>
               <a:graphicFrameLocks xmlns:a="http://schemas.openxmlformats.org/drawingml/2006/main" noChangeAspect="1"/>
             </wp:cNvGraphicFramePr>
@@ -3230,7 +3589,7 @@
                   <pic:spPr>
                     <a:xfrm>
                       <a:off x="0" y="0"/>
-                      <a:ext cx="5402032" cy="2128589"/>
+                      <a:ext cx="5400040" cy="3089275"/>
                     </a:xfrm>
                     <a:prstGeom prst="rect">
                       <a:avLst/>
@@ -3242,223 +3601,13 @@
           </wp:inline>
         </w:drawing>
       </w:r>
-    </w:p>
-    <w:p>
-      <w:pPr>
-        <w:jc w:val="both"/>
-        <w:rPr>
-          <w:rFonts w:ascii="Arial" w:hAnsi="Arial" w:cs="Arial"/>
-          <w:b/>
-          <w:bCs/>
-        </w:rPr>
-      </w:pPr>
-      <w:r>
-        <w:rPr>
-          <w:rFonts w:ascii="Arial" w:hAnsi="Arial" w:cs="Arial"/>
-          <w:b/>
-          <w:bCs/>
-        </w:rPr>
-        <w:t>SE AÑADE UN DISPOSITIVO REMOTO, CRACIÓN DE UNA RAMA MAIN, Y REALIZAMOS EL PRIMER PUSH.</w:t>
-      </w:r>
-    </w:p>
-    <w:p>
-      <w:pPr>
-        <w:jc w:val="both"/>
-        <w:rPr>
-          <w:rFonts w:ascii="Arial" w:hAnsi="Arial" w:cs="Arial"/>
-          <w:b/>
-          <w:bCs/>
-        </w:rPr>
-      </w:pPr>
-      <w:r>
-        <w:rPr>
-          <w:rFonts w:ascii="Arial" w:hAnsi="Arial" w:cs="Arial"/>
-          <w:noProof/>
-        </w:rPr>
-        <w:drawing>
-          <wp:inline distT="0" distB="0" distL="0" distR="0" wp14:anchorId="037C272D" wp14:editId="615FD6C7">
-            <wp:extent cx="5399405" cy="2159000"/>
-            <wp:effectExtent l="0" t="0" r="0" b="0"/>
-            <wp:docPr id="9" name="Imagen 9"/>
-            <wp:cNvGraphicFramePr>
-              <a:graphicFrameLocks xmlns:a="http://schemas.openxmlformats.org/drawingml/2006/main" noChangeAspect="1"/>
-            </wp:cNvGraphicFramePr>
-            <a:graphic xmlns:a="http://schemas.openxmlformats.org/drawingml/2006/main">
-              <a:graphicData uri="http://schemas.openxmlformats.org/drawingml/2006/picture">
-                <pic:pic xmlns:pic="http://schemas.openxmlformats.org/drawingml/2006/picture">
-                  <pic:nvPicPr>
-                    <pic:cNvPr id="1" name=""/>
-                    <pic:cNvPicPr/>
-                  </pic:nvPicPr>
-                  <pic:blipFill rotWithShape="1">
-                    <a:blip r:embed="rId30"/>
-                    <a:srcRect b="19205"/>
-                    <a:stretch/>
-                  </pic:blipFill>
-                  <pic:spPr bwMode="auto">
-                    <a:xfrm>
-                      <a:off x="0" y="0"/>
-                      <a:ext cx="5400045" cy="2159256"/>
-                    </a:xfrm>
-                    <a:prstGeom prst="rect">
-                      <a:avLst/>
-                    </a:prstGeom>
-                    <a:ln>
-                      <a:noFill/>
-                    </a:ln>
-                    <a:extLst>
-                      <a:ext uri="{53640926-AAD7-44D8-BBD7-CCE9431645EC}">
-                        <a14:shadowObscured xmlns:a14="http://schemas.microsoft.com/office/drawing/2010/main"/>
-                      </a:ext>
-                    </a:extLst>
-                  </pic:spPr>
-                </pic:pic>
-              </a:graphicData>
-            </a:graphic>
-          </wp:inline>
-        </w:drawing>
-      </w:r>
-    </w:p>
-    <w:p>
-      <w:pPr>
-        <w:jc w:val="both"/>
-        <w:rPr>
-          <w:rFonts w:ascii="Arial" w:hAnsi="Arial" w:cs="Arial"/>
-          <w:b/>
-          <w:bCs/>
-        </w:rPr>
-      </w:pPr>
-    </w:p>
-    <w:p>
-      <w:pPr>
-        <w:jc w:val="both"/>
-        <w:rPr>
-          <w:rFonts w:ascii="Arial" w:hAnsi="Arial" w:cs="Arial"/>
-          <w:b/>
-          <w:bCs/>
-        </w:rPr>
-      </w:pPr>
-    </w:p>
-    <w:p>
-      <w:pPr>
-        <w:jc w:val="both"/>
-        <w:rPr>
-          <w:rFonts w:ascii="Arial" w:hAnsi="Arial" w:cs="Arial"/>
-          <w:b/>
-          <w:bCs/>
-        </w:rPr>
-      </w:pPr>
-      <w:r>
-        <w:rPr>
-          <w:rFonts w:ascii="Arial" w:hAnsi="Arial" w:cs="Arial"/>
-          <w:b/>
-          <w:bCs/>
-        </w:rPr>
-        <w:t xml:space="preserve">CICLO DE </w:t>
-      </w:r>
-      <w:r>
-        <w:rPr>
-          <w:rFonts w:ascii="Arial" w:hAnsi="Arial" w:cs="Arial"/>
-          <w:b/>
-          <w:bCs/>
-        </w:rPr>
-        <w:t>ACTUALIZACION</w:t>
-      </w:r>
-    </w:p>
-    <w:p>
-      <w:pPr>
-        <w:widowControl w:val="0"/>
-        <w:pBdr>
-          <w:top w:val="nil"/>
-          <w:left w:val="nil"/>
-          <w:bottom w:val="nil"/>
-          <w:right w:val="nil"/>
-          <w:between w:val="nil"/>
-        </w:pBdr>
-        <w:spacing w:after="0" w:line="240" w:lineRule="auto"/>
-        <w:jc w:val="both"/>
+      <w:r>
         <w:rPr>
           <w:rFonts w:ascii="Arial" w:eastAsiaTheme="majorEastAsia" w:hAnsi="Arial" w:cs="Arial"/>
           <w:b/>
           <w:bCs/>
           <w:color w:val="2F5496" w:themeColor="accent1" w:themeShade="BF"/>
-          <w:lang w:eastAsia="es-EC"/>
-        </w:rPr>
-      </w:pPr>
-      <w:r>
-        <w:rPr>
-          <w:rFonts w:ascii="Arial" w:eastAsiaTheme="majorEastAsia" w:hAnsi="Arial" w:cs="Arial"/>
-          <w:b/>
-          <w:bCs/>
-          <w:noProof/>
-          <w:color w:val="2F5496" w:themeColor="accent1" w:themeShade="BF"/>
-          <w:lang w:eastAsia="es-EC"/>
-        </w:rPr>
-        <w:lastRenderedPageBreak/>
-        <w:drawing>
-          <wp:inline distT="0" distB="0" distL="0" distR="0" wp14:anchorId="1A0FE5FD" wp14:editId="36AEFF56">
-            <wp:extent cx="5400040" cy="2882900"/>
-            <wp:effectExtent l="0" t="0" r="0" b="0"/>
-            <wp:docPr id="10" name="Imagen 10"/>
-            <wp:cNvGraphicFramePr>
-              <a:graphicFrameLocks xmlns:a="http://schemas.openxmlformats.org/drawingml/2006/main" noChangeAspect="1"/>
-            </wp:cNvGraphicFramePr>
-            <a:graphic xmlns:a="http://schemas.openxmlformats.org/drawingml/2006/main">
-              <a:graphicData uri="http://schemas.openxmlformats.org/drawingml/2006/picture">
-                <pic:pic xmlns:pic="http://schemas.openxmlformats.org/drawingml/2006/picture">
-                  <pic:nvPicPr>
-                    <pic:cNvPr id="1" name=""/>
-                    <pic:cNvPicPr/>
-                  </pic:nvPicPr>
-                  <pic:blipFill>
-                    <a:blip r:embed="rId31"/>
-                    <a:stretch>
-                      <a:fillRect/>
-                    </a:stretch>
-                  </pic:blipFill>
-                  <pic:spPr>
-                    <a:xfrm>
-                      <a:off x="0" y="0"/>
-                      <a:ext cx="5400040" cy="2882900"/>
-                    </a:xfrm>
-                    <a:prstGeom prst="rect">
-                      <a:avLst/>
-                    </a:prstGeom>
-                  </pic:spPr>
-                </pic:pic>
-              </a:graphicData>
-            </a:graphic>
-          </wp:inline>
-        </w:drawing>
-      </w:r>
-    </w:p>
-    <w:p>
-      <w:pPr>
-        <w:widowControl w:val="0"/>
-        <w:pBdr>
-          <w:top w:val="nil"/>
-          <w:left w:val="nil"/>
-          <w:bottom w:val="nil"/>
-          <w:right w:val="nil"/>
-          <w:between w:val="nil"/>
-        </w:pBdr>
-        <w:spacing w:after="0" w:line="240" w:lineRule="auto"/>
-        <w:jc w:val="both"/>
-        <w:rPr>
-          <w:rFonts w:ascii="Arial" w:eastAsiaTheme="majorEastAsia" w:hAnsi="Arial" w:cs="Arial"/>
-          <w:b/>
-          <w:bCs/>
-          <w:color w:val="2F5496" w:themeColor="accent1" w:themeShade="BF"/>
-          <w:lang w:val="en-US" w:eastAsia="es-EC"/>
-        </w:rPr>
-      </w:pPr>
-      <w:r>
-        <w:rPr>
-          <w:rFonts w:ascii="Arial" w:eastAsiaTheme="majorEastAsia" w:hAnsi="Arial" w:cs="Arial"/>
-          <w:b/>
-          <w:bCs/>
-          <w:color w:val="2F5496" w:themeColor="accent1" w:themeShade="BF"/>
-          <w:lang w:val="en-US" w:eastAsia="es-EC"/>
+          <w:lang w:val="es-ES" w:eastAsia="es-EC"/>
         </w:rPr>
         <w:t xml:space="preserve"> </w:t>
       </w:r>
@@ -3472,7 +3621,7 @@
           <w:rFonts w:ascii="Arial" w:hAnsi="Arial" w:cs="Arial"/>
           <w:b/>
           <w:bCs/>
-          <w:lang w:val="en-US" w:eastAsia="es-EC"/>
+          <w:lang w:val="es-ES" w:eastAsia="es-EC"/>
         </w:rPr>
       </w:pPr>
     </w:p>
@@ -3485,21 +3634,19 @@
           <w:b/>
           <w:bCs/>
           <w:color w:val="auto"/>
-          <w:lang w:val="en-US"/>
-        </w:rPr>
-      </w:pPr>
-      <w:proofErr w:type="spellStart"/>
+          <w:lang w:val="es-ES"/>
+        </w:rPr>
+      </w:pPr>
       <w:r>
         <w:rPr>
           <w:rFonts w:ascii="Arial" w:hAnsi="Arial" w:cs="Arial"/>
           <w:b/>
           <w:bCs/>
           <w:color w:val="auto"/>
-          <w:lang w:val="en-US"/>
+          <w:lang w:val="es-ES"/>
         </w:rPr>
         <w:t>Referencias</w:t>
       </w:r>
-      <w:proofErr w:type="spellEnd"/>
     </w:p>
     <w:p>
       <w:pPr>
@@ -3725,425 +3872,8 @@
         </w:rPr>
       </w:pPr>
     </w:p>
-    <w:p>
-      <w:pPr>
-        <w:pStyle w:val="Sinespaciado"/>
-        <w:spacing w:line="360" w:lineRule="auto"/>
-        <w:jc w:val="both"/>
-        <w:rPr>
-          <w:rFonts w:ascii="Arial" w:hAnsi="Arial" w:cs="Arial"/>
-          <w:b/>
-          <w:bCs/>
-          <w:lang w:val="en-US" w:eastAsia="es-EC"/>
-        </w:rPr>
-      </w:pPr>
-    </w:p>
-    <w:p>
-      <w:pPr>
-        <w:pStyle w:val="Sinespaciado"/>
-        <w:spacing w:line="360" w:lineRule="auto"/>
-        <w:jc w:val="both"/>
-        <w:rPr>
-          <w:rFonts w:ascii="Arial" w:hAnsi="Arial" w:cs="Arial"/>
-          <w:b/>
-          <w:bCs/>
-          <w:lang w:val="en-US" w:eastAsia="es-EC"/>
-        </w:rPr>
-      </w:pPr>
-    </w:p>
-    <w:p>
-      <w:pPr>
-        <w:pStyle w:val="Sinespaciado"/>
-        <w:spacing w:line="360" w:lineRule="auto"/>
-        <w:jc w:val="both"/>
-        <w:rPr>
-          <w:rFonts w:ascii="Arial" w:hAnsi="Arial" w:cs="Arial"/>
-          <w:b/>
-          <w:bCs/>
-          <w:lang w:val="en-US" w:eastAsia="es-EC"/>
-        </w:rPr>
-      </w:pPr>
-    </w:p>
-    <w:p>
-      <w:pPr>
-        <w:pStyle w:val="Sinespaciado"/>
-        <w:spacing w:line="360" w:lineRule="auto"/>
-        <w:jc w:val="both"/>
-        <w:rPr>
-          <w:rFonts w:ascii="Arial" w:hAnsi="Arial" w:cs="Arial"/>
-          <w:b/>
-          <w:bCs/>
-          <w:lang w:val="en-US" w:eastAsia="es-EC"/>
-        </w:rPr>
-      </w:pPr>
-    </w:p>
-    <w:p>
-      <w:pPr>
-        <w:pStyle w:val="Sinespaciado"/>
-        <w:spacing w:line="360" w:lineRule="auto"/>
-        <w:jc w:val="both"/>
-        <w:rPr>
-          <w:rFonts w:ascii="Arial" w:hAnsi="Arial" w:cs="Arial"/>
-          <w:b/>
-          <w:bCs/>
-          <w:lang w:val="en-US" w:eastAsia="es-EC"/>
-        </w:rPr>
-      </w:pPr>
-    </w:p>
-    <w:p>
-      <w:pPr>
-        <w:pStyle w:val="Sinespaciado"/>
-        <w:spacing w:line="360" w:lineRule="auto"/>
-        <w:jc w:val="both"/>
-        <w:rPr>
-          <w:rFonts w:ascii="Arial" w:hAnsi="Arial" w:cs="Arial"/>
-          <w:b/>
-          <w:bCs/>
-          <w:lang w:val="en-US" w:eastAsia="es-EC"/>
-        </w:rPr>
-      </w:pPr>
-    </w:p>
-    <w:p>
-      <w:pPr>
-        <w:pStyle w:val="Sinespaciado"/>
-        <w:spacing w:line="360" w:lineRule="auto"/>
-        <w:jc w:val="both"/>
-        <w:rPr>
-          <w:rFonts w:ascii="Arial" w:hAnsi="Arial" w:cs="Arial"/>
-          <w:b/>
-          <w:bCs/>
-          <w:lang w:val="en-US" w:eastAsia="es-EC"/>
-        </w:rPr>
-      </w:pPr>
-    </w:p>
-    <w:p>
-      <w:pPr>
-        <w:pStyle w:val="Sinespaciado"/>
-        <w:spacing w:line="360" w:lineRule="auto"/>
-        <w:jc w:val="both"/>
-        <w:rPr>
-          <w:rFonts w:ascii="Arial" w:hAnsi="Arial" w:cs="Arial"/>
-          <w:b/>
-          <w:bCs/>
-          <w:lang w:val="en-US" w:eastAsia="es-EC"/>
-        </w:rPr>
-      </w:pPr>
-    </w:p>
-    <w:p>
-      <w:pPr>
-        <w:pStyle w:val="Sinespaciado"/>
-        <w:spacing w:line="360" w:lineRule="auto"/>
-        <w:jc w:val="both"/>
-        <w:rPr>
-          <w:rFonts w:ascii="Arial" w:hAnsi="Arial" w:cs="Arial"/>
-          <w:b/>
-          <w:bCs/>
-          <w:lang w:val="en-US" w:eastAsia="es-EC"/>
-        </w:rPr>
-      </w:pPr>
-    </w:p>
-    <w:p>
-      <w:pPr>
-        <w:pStyle w:val="Sinespaciado"/>
-        <w:spacing w:line="360" w:lineRule="auto"/>
-        <w:jc w:val="both"/>
-        <w:rPr>
-          <w:rFonts w:ascii="Arial" w:hAnsi="Arial" w:cs="Arial"/>
-          <w:b/>
-          <w:bCs/>
-          <w:lang w:val="en-US" w:eastAsia="es-EC"/>
-        </w:rPr>
-      </w:pPr>
-    </w:p>
-    <w:p>
-      <w:pPr>
-        <w:pStyle w:val="Sinespaciado"/>
-        <w:spacing w:line="360" w:lineRule="auto"/>
-        <w:jc w:val="both"/>
-        <w:rPr>
-          <w:rFonts w:ascii="Arial" w:hAnsi="Arial" w:cs="Arial"/>
-          <w:b/>
-          <w:bCs/>
-          <w:lang w:val="en-US" w:eastAsia="es-EC"/>
-        </w:rPr>
-      </w:pPr>
-    </w:p>
-    <w:p>
-      <w:pPr>
-        <w:pStyle w:val="Sinespaciado"/>
-        <w:spacing w:line="360" w:lineRule="auto"/>
-        <w:jc w:val="both"/>
-        <w:rPr>
-          <w:rFonts w:ascii="Arial" w:hAnsi="Arial" w:cs="Arial"/>
-          <w:b/>
-          <w:bCs/>
-          <w:lang w:val="en-US" w:eastAsia="es-EC"/>
-        </w:rPr>
-      </w:pPr>
-    </w:p>
-    <w:p>
-      <w:pPr>
-        <w:pStyle w:val="Sinespaciado"/>
-        <w:spacing w:line="360" w:lineRule="auto"/>
-        <w:jc w:val="both"/>
-        <w:rPr>
-          <w:rFonts w:ascii="Arial" w:hAnsi="Arial" w:cs="Arial"/>
-          <w:b/>
-          <w:bCs/>
-          <w:lang w:val="en-US" w:eastAsia="es-EC"/>
-        </w:rPr>
-      </w:pPr>
-    </w:p>
-    <w:p>
-      <w:pPr>
-        <w:pStyle w:val="Sinespaciado"/>
-        <w:spacing w:line="360" w:lineRule="auto"/>
-        <w:jc w:val="both"/>
-        <w:rPr>
-          <w:rFonts w:ascii="Arial" w:hAnsi="Arial" w:cs="Arial"/>
-          <w:b/>
-          <w:bCs/>
-          <w:lang w:val="en-US" w:eastAsia="es-EC"/>
-        </w:rPr>
-      </w:pPr>
-    </w:p>
-    <w:p>
-      <w:pPr>
-        <w:pStyle w:val="Sinespaciado"/>
-        <w:spacing w:line="360" w:lineRule="auto"/>
-        <w:jc w:val="both"/>
-        <w:rPr>
-          <w:rFonts w:ascii="Arial" w:hAnsi="Arial" w:cs="Arial"/>
-          <w:b/>
-          <w:bCs/>
-          <w:lang w:val="en-US" w:eastAsia="es-EC"/>
-        </w:rPr>
-      </w:pPr>
-    </w:p>
-    <w:p>
-      <w:pPr>
-        <w:pStyle w:val="Sinespaciado"/>
-        <w:spacing w:line="360" w:lineRule="auto"/>
-        <w:jc w:val="both"/>
-        <w:rPr>
-          <w:rFonts w:ascii="Arial" w:hAnsi="Arial" w:cs="Arial"/>
-          <w:b/>
-          <w:bCs/>
-          <w:sz w:val="24"/>
-          <w:szCs w:val="24"/>
-          <w:lang w:val="en-US" w:eastAsia="es-EC"/>
-        </w:rPr>
-      </w:pPr>
-      <w:proofErr w:type="spellStart"/>
-      <w:r>
-        <w:rPr>
-          <w:rFonts w:ascii="Arial" w:hAnsi="Arial" w:cs="Arial"/>
-          <w:b/>
-          <w:bCs/>
-          <w:sz w:val="24"/>
-          <w:szCs w:val="24"/>
-          <w:lang w:val="en-US" w:eastAsia="es-EC"/>
-        </w:rPr>
-        <w:t>Referencias</w:t>
-      </w:r>
-      <w:proofErr w:type="spellEnd"/>
-    </w:p>
-    <w:p>
-      <w:pPr>
-        <w:pStyle w:val="Sinespaciado"/>
-        <w:spacing w:line="360" w:lineRule="auto"/>
-        <w:jc w:val="both"/>
-        <w:rPr>
-          <w:rFonts w:ascii="Arial" w:hAnsi="Arial" w:cs="Arial"/>
-          <w:b/>
-          <w:bCs/>
-          <w:lang w:val="en-US" w:eastAsia="es-EC"/>
-        </w:rPr>
-      </w:pPr>
-    </w:p>
-    <w:p>
-      <w:pPr>
-        <w:spacing w:line="240" w:lineRule="auto"/>
-        <w:jc w:val="both"/>
-        <w:rPr>
-          <w:rFonts w:ascii="Arial" w:eastAsia="Times New Roman" w:hAnsi="Arial" w:cs="Arial"/>
-          <w:sz w:val="24"/>
-          <w:szCs w:val="24"/>
-          <w:lang w:val="en-US" w:eastAsia="es-ES"/>
-        </w:rPr>
-      </w:pPr>
-      <w:r>
-        <w:rPr>
-          <w:rFonts w:ascii="Arial" w:eastAsia="Times New Roman" w:hAnsi="Arial" w:cs="Arial"/>
-          <w:sz w:val="24"/>
-          <w:szCs w:val="24"/>
-          <w:lang w:val="en-US" w:eastAsia="es-ES"/>
-        </w:rPr>
-        <w:t xml:space="preserve">Martin, R. C. (2017). </w:t>
-      </w:r>
-      <w:r>
-        <w:rPr>
-          <w:rFonts w:ascii="Arial" w:eastAsia="Times New Roman" w:hAnsi="Arial" w:cs="Arial"/>
-          <w:i/>
-          <w:iCs/>
-          <w:sz w:val="24"/>
-          <w:szCs w:val="24"/>
-          <w:lang w:val="en-US" w:eastAsia="es-ES"/>
-        </w:rPr>
-        <w:t>Clean Architecture: A Craftsman's Guide to Software Structure and Design</w:t>
-      </w:r>
-      <w:r>
-        <w:rPr>
-          <w:rFonts w:ascii="Arial" w:eastAsia="Times New Roman" w:hAnsi="Arial" w:cs="Arial"/>
-          <w:sz w:val="24"/>
-          <w:szCs w:val="24"/>
-          <w:lang w:val="en-US" w:eastAsia="es-ES"/>
-        </w:rPr>
-        <w:t>. Prentice Hall.</w:t>
-      </w:r>
-    </w:p>
-    <w:p>
-      <w:pPr>
-        <w:spacing w:line="240" w:lineRule="auto"/>
-        <w:jc w:val="both"/>
-        <w:rPr>
-          <w:rFonts w:ascii="Arial" w:hAnsi="Arial" w:cs="Arial"/>
-          <w:sz w:val="24"/>
-          <w:szCs w:val="24"/>
-        </w:rPr>
-      </w:pPr>
-      <w:r>
-        <w:rPr>
-          <w:rFonts w:ascii="Arial" w:eastAsia="Times New Roman" w:hAnsi="Arial" w:cs="Arial"/>
-          <w:sz w:val="24"/>
-          <w:szCs w:val="24"/>
-          <w:lang w:val="en-US" w:eastAsia="es-ES"/>
-        </w:rPr>
-        <w:t xml:space="preserve">Gamma, E., Helm, R., Johnson, R., y </w:t>
-      </w:r>
-      <w:proofErr w:type="spellStart"/>
-      <w:r>
-        <w:rPr>
-          <w:rFonts w:ascii="Arial" w:eastAsia="Times New Roman" w:hAnsi="Arial" w:cs="Arial"/>
-          <w:sz w:val="24"/>
-          <w:szCs w:val="24"/>
-          <w:lang w:val="en-US" w:eastAsia="es-ES"/>
-        </w:rPr>
-        <w:t>Vlissides</w:t>
-      </w:r>
-      <w:proofErr w:type="spellEnd"/>
-      <w:r>
-        <w:rPr>
-          <w:rFonts w:ascii="Arial" w:eastAsia="Times New Roman" w:hAnsi="Arial" w:cs="Arial"/>
-          <w:sz w:val="24"/>
-          <w:szCs w:val="24"/>
-          <w:lang w:val="en-US" w:eastAsia="es-ES"/>
-        </w:rPr>
-        <w:t>, J. (1994).</w:t>
-      </w:r>
-      <w:r>
-        <w:rPr>
-          <w:rFonts w:ascii="Arial" w:hAnsi="Arial" w:cs="Arial"/>
-          <w:lang w:val="en-US"/>
-        </w:rPr>
-        <w:t xml:space="preserve"> </w:t>
-      </w:r>
-      <w:r>
-        <w:rPr>
-          <w:rStyle w:val="nfasis"/>
-          <w:rFonts w:ascii="Arial" w:hAnsi="Arial" w:cs="Arial"/>
-          <w:sz w:val="24"/>
-          <w:szCs w:val="24"/>
-          <w:lang w:val="en-US"/>
-        </w:rPr>
-        <w:t>Design patterns: Elements of reusable object-oriented software</w:t>
-      </w:r>
-      <w:r>
-        <w:rPr>
-          <w:rFonts w:ascii="Arial" w:hAnsi="Arial" w:cs="Arial"/>
-          <w:sz w:val="24"/>
-          <w:szCs w:val="24"/>
-          <w:lang w:val="en-US"/>
-        </w:rPr>
-        <w:t xml:space="preserve">. </w:t>
-      </w:r>
-      <w:r>
-        <w:rPr>
-          <w:rFonts w:ascii="Arial" w:hAnsi="Arial" w:cs="Arial"/>
-          <w:sz w:val="24"/>
-          <w:szCs w:val="24"/>
-        </w:rPr>
-        <w:t>Addison-Wesley.</w:t>
-      </w:r>
-    </w:p>
-    <w:p>
-      <w:pPr>
-        <w:widowControl w:val="0"/>
-        <w:pBdr>
-          <w:top w:val="nil"/>
-          <w:left w:val="nil"/>
-          <w:bottom w:val="nil"/>
-          <w:right w:val="nil"/>
-          <w:between w:val="nil"/>
-        </w:pBdr>
-        <w:spacing w:after="0" w:line="240" w:lineRule="auto"/>
-        <w:jc w:val="both"/>
-        <w:rPr>
-          <w:rFonts w:ascii="Arial" w:hAnsi="Arial" w:cs="Arial"/>
-          <w:sz w:val="24"/>
-          <w:szCs w:val="24"/>
-        </w:rPr>
-      </w:pPr>
-      <w:r>
-        <w:rPr>
-          <w:rFonts w:ascii="Arial" w:hAnsi="Arial" w:cs="Arial"/>
-          <w:sz w:val="24"/>
-          <w:szCs w:val="24"/>
-        </w:rPr>
-        <w:t xml:space="preserve">Sommerville, I. (2011). </w:t>
-      </w:r>
-      <w:r>
-        <w:rPr>
-          <w:rStyle w:val="nfasis"/>
-          <w:rFonts w:ascii="Arial" w:hAnsi="Arial" w:cs="Arial"/>
-          <w:sz w:val="24"/>
-          <w:szCs w:val="24"/>
-        </w:rPr>
-        <w:t>Ingeniería de Software</w:t>
-      </w:r>
-      <w:r>
-        <w:rPr>
-          <w:rFonts w:ascii="Arial" w:hAnsi="Arial" w:cs="Arial"/>
-          <w:sz w:val="24"/>
-          <w:szCs w:val="24"/>
-        </w:rPr>
-        <w:t xml:space="preserve"> (9na ed.). Pearson Educación.</w:t>
-      </w:r>
-    </w:p>
-    <w:p>
-      <w:pPr>
-        <w:widowControl w:val="0"/>
-        <w:pBdr>
-          <w:top w:val="nil"/>
-          <w:left w:val="nil"/>
-          <w:bottom w:val="nil"/>
-          <w:right w:val="nil"/>
-          <w:between w:val="nil"/>
-        </w:pBdr>
-        <w:spacing w:after="0" w:line="240" w:lineRule="auto"/>
-        <w:jc w:val="both"/>
-        <w:rPr>
-          <w:rFonts w:ascii="Arial" w:hAnsi="Arial" w:cs="Arial"/>
-          <w:i/>
-          <w:iCs/>
-          <w:sz w:val="24"/>
-          <w:szCs w:val="24"/>
-          <w:lang w:eastAsia="es-EC"/>
-        </w:rPr>
-      </w:pPr>
-    </w:p>
     <w:sectPr>
-      <w:headerReference w:type="first" r:id="rId32"/>
+      <w:headerReference w:type="first" r:id="rId30"/>
       <w:pgSz w:w="11906" w:h="16838"/>
       <w:pgMar w:top="1417" w:right="1701" w:bottom="1417" w:left="1701" w:header="708" w:footer="708" w:gutter="0"/>
       <w:pgNumType w:start="1"/>
@@ -5019,7 +4749,7 @@
         <v:path o:extrusionok="f" gradientshapeok="t" o:connecttype="rect"/>
         <o:lock v:ext="edit" aspectratio="t"/>
       </v:shapetype>
-      <v:shape id="_x0000_i1071" type="#_x0000_t75" style="width:11.75pt;height:11.75pt" o:bullet="t">
+      <v:shape id="_x0000_i1062" type="#_x0000_t75" style="width:11.85pt;height:11.85pt" o:bullet="t">
         <v:imagedata r:id="rId1" o:title="mso3E28"/>
       </v:shape>
     </w:pict>

</xml_diff>

<commit_message>
fix: actualización final de la actividad 3
</commit_message>
<xml_diff>
--- a/ACTIVIDAD_3_HELPDESK_HTML/MAURO_POMAGUALLI_ACTIVIDAD_3.docx
+++ b/ACTIVIDAD_3_HELPDESK_HTML/MAURO_POMAGUALLI_ACTIVIDAD_3.docx
@@ -593,43 +593,7 @@
           <w:b/>
           <w:bCs/>
         </w:rPr>
-        <w:t xml:space="preserve">Proyecto Práctico - Maquetación Estructural del </w:t>
-      </w:r>
-      <w:proofErr w:type="spellStart"/>
-      <w:r>
-        <w:rPr>
-          <w:rFonts w:ascii="Arial" w:hAnsi="Arial" w:cs="Arial"/>
-          <w:b/>
-          <w:bCs/>
-        </w:rPr>
-        <w:t>Help</w:t>
-      </w:r>
-      <w:proofErr w:type="spellEnd"/>
-      <w:r>
-        <w:rPr>
-          <w:rFonts w:ascii="Arial" w:hAnsi="Arial" w:cs="Arial"/>
-          <w:b/>
-          <w:bCs/>
-        </w:rPr>
-        <w:t xml:space="preserve"> </w:t>
-      </w:r>
-      <w:proofErr w:type="spellStart"/>
-      <w:r>
-        <w:rPr>
-          <w:rFonts w:ascii="Arial" w:hAnsi="Arial" w:cs="Arial"/>
-          <w:b/>
-          <w:bCs/>
-        </w:rPr>
-        <w:t>Desk</w:t>
-      </w:r>
-      <w:proofErr w:type="spellEnd"/>
-      <w:r>
-        <w:rPr>
-          <w:rFonts w:ascii="Arial" w:hAnsi="Arial" w:cs="Arial"/>
-          <w:b/>
-          <w:bCs/>
-        </w:rPr>
-        <w:t xml:space="preserve"> (HTML5)</w:t>
+        <w:t>Proyecto Práctico - Maquetación Estructural del Help Desk (HTML5)</w:t>
       </w:r>
     </w:p>
     <w:p>
@@ -1116,39 +1080,7 @@
           <w:rFonts w:ascii="Arial" w:hAnsi="Arial" w:cs="Arial"/>
           <w:lang w:eastAsia="es-EC"/>
         </w:rPr>
-        <w:t>Implementar la estructura fundamental de un sistema web de gestión de incidentes (</w:t>
-      </w:r>
-      <w:proofErr w:type="spellStart"/>
-      <w:r>
-        <w:rPr>
-          <w:rFonts w:ascii="Arial" w:hAnsi="Arial" w:cs="Arial"/>
-          <w:lang w:eastAsia="es-EC"/>
-        </w:rPr>
-        <w:t>Help</w:t>
-      </w:r>
-      <w:proofErr w:type="spellEnd"/>
-      <w:r>
-        <w:rPr>
-          <w:rFonts w:ascii="Arial" w:hAnsi="Arial" w:cs="Arial"/>
-          <w:lang w:eastAsia="es-EC"/>
-        </w:rPr>
-        <w:t xml:space="preserve"> </w:t>
-      </w:r>
-      <w:proofErr w:type="spellStart"/>
-      <w:r>
-        <w:rPr>
-          <w:rFonts w:ascii="Arial" w:hAnsi="Arial" w:cs="Arial"/>
-          <w:lang w:eastAsia="es-EC"/>
-        </w:rPr>
-        <w:t>Desk</w:t>
-      </w:r>
-      <w:proofErr w:type="spellEnd"/>
-      <w:r>
-        <w:rPr>
-          <w:rFonts w:ascii="Arial" w:hAnsi="Arial" w:cs="Arial"/>
-          <w:lang w:eastAsia="es-EC"/>
-        </w:rPr>
-        <w:t>) utilizando lenguaje de marcado HTML5 y etiquetas semánticas, asegurando la interoperabilidad, accesibilidad y el cumplimiento de los estándares de la W3C.</w:t>
+        <w:t>Implementar la estructura fundamental de un sistema web de gestión de incidentes (Help Desk) utilizando lenguaje de marcado HTML5 y etiquetas semánticas, asegurando la interoperabilidad, accesibilidad y el cumplimiento de los estándares de la W3C.</w:t>
       </w:r>
     </w:p>
     <w:p>
@@ -1227,39 +1159,7 @@
           <w:rFonts w:ascii="Arial" w:hAnsi="Arial" w:cs="Arial"/>
           <w:lang w:eastAsia="es-EC"/>
         </w:rPr>
-        <w:t xml:space="preserve">El estudiante debe transformar el diseño arquitectónico de la Unidad 1 en un prototipo estructural funcional (sin estilos CSS aún). Se deben crear tres páginas web interconectadas que representen las interfaces principales del sistema de </w:t>
-      </w:r>
-      <w:proofErr w:type="spellStart"/>
-      <w:r>
-        <w:rPr>
-          <w:rFonts w:ascii="Arial" w:hAnsi="Arial" w:cs="Arial"/>
-          <w:lang w:eastAsia="es-EC"/>
-        </w:rPr>
-        <w:t>Help</w:t>
-      </w:r>
-      <w:proofErr w:type="spellEnd"/>
-      <w:r>
-        <w:rPr>
-          <w:rFonts w:ascii="Arial" w:hAnsi="Arial" w:cs="Arial"/>
-          <w:lang w:eastAsia="es-EC"/>
-        </w:rPr>
-        <w:t xml:space="preserve"> </w:t>
-      </w:r>
-      <w:proofErr w:type="spellStart"/>
-      <w:r>
-        <w:rPr>
-          <w:rFonts w:ascii="Arial" w:hAnsi="Arial" w:cs="Arial"/>
-          <w:lang w:eastAsia="es-EC"/>
-        </w:rPr>
-        <w:t>Desk</w:t>
-      </w:r>
-      <w:proofErr w:type="spellEnd"/>
-      <w:r>
-        <w:rPr>
-          <w:rFonts w:ascii="Arial" w:hAnsi="Arial" w:cs="Arial"/>
-          <w:lang w:eastAsia="es-EC"/>
-        </w:rPr>
-        <w:t>, aplicando correctamente la jerarquía de etiquetas y formularios de captura de datos.</w:t>
+        <w:t>El estudiante debe transformar el diseño arquitectónico de la Unidad 1 en un prototipo estructural funcional (sin estilos CSS aún). Se deben crear tres páginas web interconectadas que representen las interfaces principales del sistema de Help Desk, aplicando correctamente la jerarquía de etiquetas y formularios de captura de datos.</w:t>
       </w:r>
     </w:p>
     <w:p>
@@ -1324,35 +1224,7 @@
         <w:rPr>
           <w:rFonts w:ascii="Arial" w:hAnsi="Arial" w:cs="Arial"/>
         </w:rPr>
-        <w:t xml:space="preserve">El desarrollo de sistemas web constituye una competencia fundamental dentro del área de tecnologías de la información. Para esta actividad se implementó un prototipo funcional de un sistema </w:t>
-      </w:r>
-      <w:proofErr w:type="spellStart"/>
-      <w:r>
-        <w:rPr>
-          <w:rFonts w:ascii="Arial" w:hAnsi="Arial" w:cs="Arial"/>
-        </w:rPr>
-        <w:t>Help</w:t>
-      </w:r>
-      <w:proofErr w:type="spellEnd"/>
-      <w:r>
-        <w:rPr>
-          <w:rFonts w:ascii="Arial" w:hAnsi="Arial" w:cs="Arial"/>
-        </w:rPr>
-        <w:t xml:space="preserve"> </w:t>
-      </w:r>
-      <w:proofErr w:type="spellStart"/>
-      <w:r>
-        <w:rPr>
-          <w:rFonts w:ascii="Arial" w:hAnsi="Arial" w:cs="Arial"/>
-        </w:rPr>
-        <w:t>Desk</w:t>
-      </w:r>
-      <w:proofErr w:type="spellEnd"/>
-      <w:r>
-        <w:rPr>
-          <w:rFonts w:ascii="Arial" w:hAnsi="Arial" w:cs="Arial"/>
-        </w:rPr>
-        <w:t xml:space="preserve"> orientado a la gestión de incidentes tecnológicos en un entorno de Data Center. La solución fue desarrollada mediante HTML5 semántico, aplicando buenas prácticas de accesibilidad, organización estructural y cumplimiento de estándares web. Según Sommerville (2011), una adecuada definición de la estructura de un sistema permite facilitar su mantenimiento y evolución durante futuras fases del ciclo de vida del software.</w:t>
+        <w:t>El desarrollo de sistemas web constituye una competencia fundamental dentro del área de tecnologías de la información. Para esta actividad se implementó un prototipo funcional de un sistema Help Desk orientado a la gestión de incidentes tecnológicos en un entorno de Data Center. La solución fue desarrollada mediante HTML5 semántico, aplicando buenas prácticas de accesibilidad, organización estructural y cumplimiento de estándares web. Según Sommerville (2011), una adecuada definición de la estructura de un sistema permite facilitar su mantenimiento y evolución durante futuras fases del ciclo de vida del software.</w:t>
       </w:r>
     </w:p>
     <w:p>
@@ -1387,35 +1259,7 @@
         <w:rPr>
           <w:rFonts w:ascii="Arial" w:hAnsi="Arial" w:cs="Arial"/>
         </w:rPr>
-        <w:t xml:space="preserve">Implementar la estructura fundamental de un sistema web de gestión de incidentes utilizando HTML5 y etiquetas semánticas, garantizando interoperabilidad, accesibilidad y cumplimiento de los estándares establecidos por el </w:t>
-      </w:r>
-      <w:proofErr w:type="spellStart"/>
-      <w:r>
-        <w:rPr>
-          <w:rFonts w:ascii="Arial" w:hAnsi="Arial" w:cs="Arial"/>
-        </w:rPr>
-        <w:t>World</w:t>
-      </w:r>
-      <w:proofErr w:type="spellEnd"/>
-      <w:r>
-        <w:rPr>
-          <w:rFonts w:ascii="Arial" w:hAnsi="Arial" w:cs="Arial"/>
-        </w:rPr>
-        <w:t xml:space="preserve"> Wide Web </w:t>
-      </w:r>
-      <w:proofErr w:type="spellStart"/>
-      <w:r>
-        <w:rPr>
-          <w:rFonts w:ascii="Arial" w:hAnsi="Arial" w:cs="Arial"/>
-        </w:rPr>
-        <w:t>Consortium</w:t>
-      </w:r>
-      <w:proofErr w:type="spellEnd"/>
-      <w:r>
-        <w:rPr>
-          <w:rFonts w:ascii="Arial" w:hAnsi="Arial" w:cs="Arial"/>
-        </w:rPr>
-        <w:t xml:space="preserve"> (W3C).</w:t>
+        <w:t>Implementar la estructura fundamental de un sistema web de gestión de incidentes utilizando HTML5 y etiquetas semánticas, garantizando interoperabilidad, accesibilidad y cumplimiento de los estándares establecidos por el World Wide Web Consortium (W3C).</w:t>
       </w:r>
     </w:p>
     <w:p>
@@ -1485,105 +1329,7 @@
         <w:rPr>
           <w:rFonts w:ascii="Arial" w:hAnsi="Arial" w:cs="Arial"/>
         </w:rPr>
-        <w:t xml:space="preserve">La página principal fue diseñada como un </w:t>
-      </w:r>
-      <w:proofErr w:type="spellStart"/>
-      <w:r>
-        <w:rPr>
-          <w:rFonts w:ascii="Arial" w:hAnsi="Arial" w:cs="Arial"/>
-        </w:rPr>
-        <w:t>dashboard</w:t>
-      </w:r>
-      <w:proofErr w:type="spellEnd"/>
-      <w:r>
-        <w:rPr>
-          <w:rFonts w:ascii="Arial" w:hAnsi="Arial" w:cs="Arial"/>
-        </w:rPr>
-        <w:t xml:space="preserve"> informativo. Se implementaron las etiquetas semánticas </w:t>
-      </w:r>
-      <w:proofErr w:type="spellStart"/>
-      <w:r>
-        <w:rPr>
-          <w:rFonts w:ascii="Arial" w:hAnsi="Arial" w:cs="Arial"/>
-        </w:rPr>
-        <w:t>header</w:t>
-      </w:r>
-      <w:proofErr w:type="spellEnd"/>
-      <w:r>
-        <w:rPr>
-          <w:rFonts w:ascii="Arial" w:hAnsi="Arial" w:cs="Arial"/>
-        </w:rPr>
-        <w:t xml:space="preserve">, </w:t>
-      </w:r>
-      <w:proofErr w:type="spellStart"/>
-      <w:r>
-        <w:rPr>
-          <w:rFonts w:ascii="Arial" w:hAnsi="Arial" w:cs="Arial"/>
-        </w:rPr>
-        <w:t>nav</w:t>
-      </w:r>
-      <w:proofErr w:type="spellEnd"/>
-      <w:r>
-        <w:rPr>
-          <w:rFonts w:ascii="Arial" w:hAnsi="Arial" w:cs="Arial"/>
-        </w:rPr>
-        <w:t xml:space="preserve">, </w:t>
-      </w:r>
-      <w:proofErr w:type="spellStart"/>
-      <w:r>
-        <w:rPr>
-          <w:rFonts w:ascii="Arial" w:hAnsi="Arial" w:cs="Arial"/>
-        </w:rPr>
-        <w:t>main</w:t>
-      </w:r>
-      <w:proofErr w:type="spellEnd"/>
-      <w:r>
-        <w:rPr>
-          <w:rFonts w:ascii="Arial" w:hAnsi="Arial" w:cs="Arial"/>
-        </w:rPr>
-        <w:t xml:space="preserve">, </w:t>
-      </w:r>
-      <w:proofErr w:type="spellStart"/>
-      <w:r>
-        <w:rPr>
-          <w:rFonts w:ascii="Arial" w:hAnsi="Arial" w:cs="Arial"/>
-        </w:rPr>
-        <w:t>section</w:t>
-      </w:r>
-      <w:proofErr w:type="spellEnd"/>
-      <w:r>
-        <w:rPr>
-          <w:rFonts w:ascii="Arial" w:hAnsi="Arial" w:cs="Arial"/>
-        </w:rPr>
-        <w:t xml:space="preserve">, </w:t>
-      </w:r>
-      <w:proofErr w:type="spellStart"/>
-      <w:r>
-        <w:rPr>
-          <w:rFonts w:ascii="Arial" w:hAnsi="Arial" w:cs="Arial"/>
-        </w:rPr>
-        <w:t>article</w:t>
-      </w:r>
-      <w:proofErr w:type="spellEnd"/>
-      <w:r>
-        <w:rPr>
-          <w:rFonts w:ascii="Arial" w:hAnsi="Arial" w:cs="Arial"/>
-        </w:rPr>
-        <w:t xml:space="preserve"> y </w:t>
-      </w:r>
-      <w:proofErr w:type="spellStart"/>
-      <w:r>
-        <w:rPr>
-          <w:rFonts w:ascii="Arial" w:hAnsi="Arial" w:cs="Arial"/>
-        </w:rPr>
-        <w:t>footer</w:t>
-      </w:r>
-      <w:proofErr w:type="spellEnd"/>
-      <w:r>
-        <w:rPr>
-          <w:rFonts w:ascii="Arial" w:hAnsi="Arial" w:cs="Arial"/>
-        </w:rPr>
-        <w:t xml:space="preserve">. Además, se incorporó información relacionada con las categorías de incidentes: Hardware, Red y Software. </w:t>
+        <w:t xml:space="preserve">La página principal fue diseñada como un dashboard informativo. Se implementaron las etiquetas semánticas header, nav, main, section, article y footer. Además, se incorporó información relacionada con las categorías de incidentes: Hardware, Red y Software. </w:t>
       </w:r>
       <w:r>
         <w:rPr>
@@ -1678,35 +1424,7 @@
         <w:rPr>
           <w:rFonts w:ascii="Arial" w:hAnsi="Arial" w:cs="Arial"/>
         </w:rPr>
-        <w:t>En esta sección se construyó el formulario de registro de incidentes. Se utilizaron campos de texto, listas desplegables, botones de opción y áreas de texto para capturar información relevante. La estructura fue diseñada considerando principios de usabilidad y accesibilidad recomendados para aplicaciones web modernas (</w:t>
-      </w:r>
-      <w:proofErr w:type="spellStart"/>
-      <w:r>
-        <w:rPr>
-          <w:rFonts w:ascii="Arial" w:hAnsi="Arial" w:cs="Arial"/>
-        </w:rPr>
-        <w:t>World</w:t>
-      </w:r>
-      <w:proofErr w:type="spellEnd"/>
-      <w:r>
-        <w:rPr>
-          <w:rFonts w:ascii="Arial" w:hAnsi="Arial" w:cs="Arial"/>
-        </w:rPr>
-        <w:t xml:space="preserve"> Wide Web </w:t>
-      </w:r>
-      <w:proofErr w:type="spellStart"/>
-      <w:r>
-        <w:rPr>
-          <w:rFonts w:ascii="Arial" w:hAnsi="Arial" w:cs="Arial"/>
-        </w:rPr>
-        <w:t>Consortium</w:t>
-      </w:r>
-      <w:proofErr w:type="spellEnd"/>
-      <w:r>
-        <w:rPr>
-          <w:rFonts w:ascii="Arial" w:hAnsi="Arial" w:cs="Arial"/>
-        </w:rPr>
-        <w:t>, 2025).</w:t>
+        <w:t>En esta sección se construyó el formulario de registro de incidentes. Se utilizaron campos de texto, listas desplegables, botones de opción y áreas de texto para capturar información relevante. La estructura fue diseñada considerando principios de usabilidad y accesibilidad recomendados para aplicaciones web modernas (World Wide Web Consortium, 2025).</w:t>
       </w:r>
       <w:r>
         <w:rPr>
@@ -1930,49 +1648,7 @@
         <w:rPr>
           <w:rFonts w:ascii="Arial" w:hAnsi="Arial" w:cs="Arial"/>
         </w:rPr>
-        <w:t xml:space="preserve">Una vez finalizado el desarrollo se realizó la validación de los tres documentos HTML utilizando el servicio oficial </w:t>
-      </w:r>
-      <w:proofErr w:type="spellStart"/>
-      <w:r>
-        <w:rPr>
-          <w:rFonts w:ascii="Arial" w:hAnsi="Arial" w:cs="Arial"/>
-        </w:rPr>
-        <w:t>Markup</w:t>
-      </w:r>
-      <w:proofErr w:type="spellEnd"/>
-      <w:r>
-        <w:rPr>
-          <w:rFonts w:ascii="Arial" w:hAnsi="Arial" w:cs="Arial"/>
-        </w:rPr>
-        <w:t xml:space="preserve"> </w:t>
-      </w:r>
-      <w:proofErr w:type="spellStart"/>
-      <w:r>
-        <w:rPr>
-          <w:rFonts w:ascii="Arial" w:hAnsi="Arial" w:cs="Arial"/>
-        </w:rPr>
-        <w:t>Validation</w:t>
-      </w:r>
-      <w:proofErr w:type="spellEnd"/>
-      <w:r>
-        <w:rPr>
-          <w:rFonts w:ascii="Arial" w:hAnsi="Arial" w:cs="Arial"/>
-        </w:rPr>
-        <w:t xml:space="preserve"> </w:t>
-      </w:r>
-      <w:proofErr w:type="spellStart"/>
-      <w:r>
-        <w:rPr>
-          <w:rFonts w:ascii="Arial" w:hAnsi="Arial" w:cs="Arial"/>
-        </w:rPr>
-        <w:t>Service</w:t>
-      </w:r>
-      <w:proofErr w:type="spellEnd"/>
-      <w:r>
-        <w:rPr>
-          <w:rFonts w:ascii="Arial" w:hAnsi="Arial" w:cs="Arial"/>
-        </w:rPr>
-        <w:t xml:space="preserve">. Durante las primeras pruebas se identificaron advertencias relacionadas con elementos </w:t>
+        <w:t xml:space="preserve">Una vez finalizado el desarrollo se realizó la validación de los tres documentos HTML utilizando el servicio oficial Markup Validation Service. Durante las primeras pruebas se identificaron advertencias relacionadas con elementos </w:t>
       </w:r>
       <w:r>
         <w:rPr>
@@ -1980,14 +1656,12 @@
         </w:rPr>
         <w:t>“</w:t>
       </w:r>
-      <w:proofErr w:type="spellStart"/>
       <w:r>
         <w:rPr>
           <w:rFonts w:ascii="Arial" w:hAnsi="Arial" w:cs="Arial"/>
         </w:rPr>
         <w:t>article</w:t>
       </w:r>
-      <w:proofErr w:type="spellEnd"/>
       <w:r>
         <w:rPr>
           <w:rFonts w:ascii="Arial" w:hAnsi="Arial" w:cs="Arial"/>
@@ -2006,14 +1680,12 @@
         </w:rPr>
         <w:t>“</w:t>
       </w:r>
-      <w:proofErr w:type="spellStart"/>
       <w:r>
         <w:rPr>
           <w:rFonts w:ascii="Arial" w:hAnsi="Arial" w:cs="Arial"/>
         </w:rPr>
         <w:t>section</w:t>
       </w:r>
-      <w:proofErr w:type="spellEnd"/>
       <w:r>
         <w:rPr>
           <w:rFonts w:ascii="Arial" w:hAnsi="Arial" w:cs="Arial"/>
@@ -2593,35 +2265,7 @@
         <w:rPr>
           <w:rFonts w:ascii="Arial" w:hAnsi="Arial" w:cs="Arial"/>
         </w:rPr>
-        <w:t xml:space="preserve">Se desarrolló satisfactoriamente un sistema </w:t>
-      </w:r>
-      <w:proofErr w:type="spellStart"/>
-      <w:r>
-        <w:rPr>
-          <w:rFonts w:ascii="Arial" w:hAnsi="Arial" w:cs="Arial"/>
-        </w:rPr>
-        <w:t>Help</w:t>
-      </w:r>
-      <w:proofErr w:type="spellEnd"/>
-      <w:r>
-        <w:rPr>
-          <w:rFonts w:ascii="Arial" w:hAnsi="Arial" w:cs="Arial"/>
-        </w:rPr>
-        <w:t xml:space="preserve"> </w:t>
-      </w:r>
-      <w:proofErr w:type="spellStart"/>
-      <w:r>
-        <w:rPr>
-          <w:rFonts w:ascii="Arial" w:hAnsi="Arial" w:cs="Arial"/>
-        </w:rPr>
-        <w:t>Desk</w:t>
-      </w:r>
-      <w:proofErr w:type="spellEnd"/>
-      <w:r>
-        <w:rPr>
-          <w:rFonts w:ascii="Arial" w:hAnsi="Arial" w:cs="Arial"/>
-        </w:rPr>
-        <w:t xml:space="preserve"> basado en HTML5 que cumple con los requisitos establecidos en la actividad académica. La aplicación de etiquetas semánticas permitió mejorar la calidad estructural del proyecto. Además, la validación W3C confirmó el cumplimiento de los estándares internacionales para documentos HTML.</w:t>
+        <w:t>Se desarrolló satisfactoriamente un sistema Help Desk basado en HTML5 que cumple con los requisitos establecidos en la actividad académica. La aplicación de etiquetas semánticas permitió mejorar la calidad estructural del proyecto. Además, la validación W3C confirmó el cumplimiento de los estándares internacionales para documentos HTML.</w:t>
       </w:r>
       <w:r>
         <w:rPr>
@@ -2680,7 +2324,6 @@
         </w:rPr>
         <w:t xml:space="preserve"> DE CREACION DE LA RAMA “</w:t>
       </w:r>
-      <w:proofErr w:type="spellStart"/>
       <w:r>
         <w:rPr>
           <w:rFonts w:ascii="Arial" w:hAnsi="Arial" w:cs="Arial"/>
@@ -2688,29 +2331,8 @@
           <w:bCs/>
           <w:lang w:eastAsia="es-EC"/>
         </w:rPr>
-        <w:t>feature</w:t>
-      </w:r>
-      <w:proofErr w:type="spellEnd"/>
-      <w:r>
-        <w:rPr>
-          <w:rFonts w:ascii="Arial" w:hAnsi="Arial" w:cs="Arial"/>
-          <w:b/>
-          <w:bCs/>
-          <w:lang w:eastAsia="es-EC"/>
-        </w:rPr>
-        <w:t>/</w:t>
-      </w:r>
-      <w:proofErr w:type="spellStart"/>
-      <w:r>
-        <w:rPr>
-          <w:rFonts w:ascii="Arial" w:hAnsi="Arial" w:cs="Arial"/>
-          <w:b/>
-          <w:bCs/>
-          <w:lang w:eastAsia="es-EC"/>
-        </w:rPr>
-        <w:t>maquetacion-html</w:t>
-      </w:r>
-      <w:proofErr w:type="spellEnd"/>
+        <w:t>feature/maquetacion-html</w:t>
+      </w:r>
       <w:r>
         <w:rPr>
           <w:rFonts w:ascii="Arial" w:hAnsi="Arial" w:cs="Arial"/>
@@ -2782,14 +2404,61 @@
         <w:pStyle w:val="Sinespaciado"/>
         <w:spacing w:line="360" w:lineRule="auto"/>
         <w:ind w:left="360"/>
-        <w:jc w:val="both"/>
-        <w:rPr>
-          <w:rFonts w:ascii="Arial" w:hAnsi="Arial" w:cs="Arial"/>
-          <w:b/>
-          <w:bCs/>
-          <w:lang w:val="en-US" w:eastAsia="es-EC"/>
-        </w:rPr>
-      </w:pPr>
+        <w:rPr>
+          <w:rFonts w:ascii="Arial" w:hAnsi="Arial" w:cs="Arial"/>
+          <w:b/>
+          <w:bCs/>
+          <w:lang w:val="es-ES" w:eastAsia="es-EC"/>
+        </w:rPr>
+      </w:pPr>
+      <w:r>
+        <w:rPr>
+          <w:rFonts w:ascii="Arial" w:hAnsi="Arial" w:cs="Arial"/>
+          <w:b/>
+          <w:bCs/>
+          <w:lang w:val="es-ES" w:eastAsia="es-EC"/>
+        </w:rPr>
+        <w:t>Link Drive de los archivos HTML</w:t>
+      </w:r>
+      <w:r>
+        <w:rPr>
+          <w:rFonts w:ascii="Arial" w:hAnsi="Arial" w:cs="Arial"/>
+          <w:b/>
+          <w:bCs/>
+          <w:lang w:val="es-ES" w:eastAsia="es-EC"/>
+        </w:rPr>
+        <w:t>5</w:t>
+      </w:r>
+      <w:r>
+        <w:rPr>
+          <w:rFonts w:ascii="Arial" w:hAnsi="Arial" w:cs="Arial"/>
+          <w:b/>
+          <w:bCs/>
+          <w:lang w:val="es-ES" w:eastAsia="es-EC"/>
+        </w:rPr>
+        <w:t xml:space="preserve">: </w:t>
+      </w:r>
+      <w:hyperlink r:id="rId27" w:history="1">
+        <w:r>
+          <w:rPr>
+            <w:rStyle w:val="Hipervnculo"/>
+            <w:rFonts w:ascii="Arial" w:hAnsi="Arial" w:cs="Arial"/>
+            <w:b/>
+            <w:bCs/>
+            <w:lang w:val="es-ES" w:eastAsia="es-EC"/>
+          </w:rPr>
+          <w:t>https://drive.google.com/drive/folders/1N9O_pz8M4DxMsrMguxCjzwTC3Ef_B6sn?usp=sharing</w:t>
+        </w:r>
+      </w:hyperlink>
+      <w:r>
+        <w:rPr>
+          <w:rFonts w:ascii="Arial" w:hAnsi="Arial" w:cs="Arial"/>
+          <w:b/>
+          <w:bCs/>
+          <w:lang w:val="es-ES" w:eastAsia="es-EC"/>
+        </w:rPr>
+        <w:t xml:space="preserve"> </w:t>
+      </w:r>
     </w:p>
     <w:p>
       <w:pPr>
@@ -2801,7 +2470,7 @@
           <w:rFonts w:ascii="Arial" w:hAnsi="Arial" w:cs="Arial"/>
           <w:b/>
           <w:bCs/>
-          <w:lang w:val="en-US" w:eastAsia="es-EC"/>
+          <w:lang w:val="es-ES" w:eastAsia="es-EC"/>
         </w:rPr>
       </w:pPr>
     </w:p>
@@ -2815,7 +2484,7 @@
           <w:rFonts w:ascii="Arial" w:hAnsi="Arial" w:cs="Arial"/>
           <w:b/>
           <w:bCs/>
-          <w:lang w:val="en-US" w:eastAsia="es-EC"/>
+          <w:lang w:val="es-ES" w:eastAsia="es-EC"/>
         </w:rPr>
       </w:pPr>
     </w:p>
@@ -2829,7 +2498,7 @@
           <w:rFonts w:ascii="Arial" w:hAnsi="Arial" w:cs="Arial"/>
           <w:b/>
           <w:bCs/>
-          <w:lang w:val="en-US" w:eastAsia="es-EC"/>
+          <w:lang w:val="es-ES" w:eastAsia="es-EC"/>
         </w:rPr>
       </w:pPr>
     </w:p>
@@ -2843,7 +2512,7 @@
           <w:rFonts w:ascii="Arial" w:hAnsi="Arial" w:cs="Arial"/>
           <w:b/>
           <w:bCs/>
-          <w:lang w:val="en-US" w:eastAsia="es-EC"/>
+          <w:lang w:val="es-ES" w:eastAsia="es-EC"/>
         </w:rPr>
       </w:pPr>
     </w:p>
@@ -2857,7 +2526,7 @@
           <w:rFonts w:ascii="Arial" w:hAnsi="Arial" w:cs="Arial"/>
           <w:b/>
           <w:bCs/>
-          <w:lang w:val="en-US" w:eastAsia="es-EC"/>
+          <w:lang w:val="es-ES" w:eastAsia="es-EC"/>
         </w:rPr>
       </w:pPr>
     </w:p>
@@ -2871,7 +2540,7 @@
           <w:rFonts w:ascii="Arial" w:hAnsi="Arial" w:cs="Arial"/>
           <w:b/>
           <w:bCs/>
-          <w:lang w:val="en-US" w:eastAsia="es-EC"/>
+          <w:lang w:val="es-ES" w:eastAsia="es-EC"/>
         </w:rPr>
       </w:pPr>
     </w:p>
@@ -2883,6 +2552,20 @@
         <w:jc w:val="both"/>
         <w:rPr>
           <w:rFonts w:ascii="Arial" w:hAnsi="Arial" w:cs="Arial"/>
+          <w:b/>
+          <w:bCs/>
+          <w:lang w:val="es-ES" w:eastAsia="es-EC"/>
+        </w:rPr>
+      </w:pPr>
+    </w:p>
+    <w:p>
+      <w:pPr>
+        <w:pStyle w:val="Sinespaciado"/>
+        <w:spacing w:line="360" w:lineRule="auto"/>
+        <w:ind w:left="360"/>
+        <w:jc w:val="both"/>
+        <w:rPr>
+          <w:rFonts w:ascii="Arial" w:hAnsi="Arial" w:cs="Arial"/>
           <w:lang w:val="es-ES" w:eastAsia="es-EC"/>
         </w:rPr>
       </w:pPr>
@@ -2892,7 +2575,6 @@
           <w:noProof/>
           <w:lang w:eastAsia="es-EC"/>
         </w:rPr>
-        <w:lastRenderedPageBreak/>
         <mc:AlternateContent>
           <mc:Choice Requires="wps">
             <w:drawing>
@@ -2974,39 +2656,7 @@
           <w:rFonts w:ascii="Arial" w:hAnsi="Arial" w:cs="Arial"/>
           <w:lang w:eastAsia="es-EC"/>
         </w:rPr>
-        <w:t>CREACION DE LA RAMA “</w:t>
-      </w:r>
-      <w:proofErr w:type="spellStart"/>
-      <w:r>
-        <w:rPr>
-          <w:rFonts w:ascii="Arial" w:hAnsi="Arial" w:cs="Arial"/>
-          <w:lang w:eastAsia="es-EC"/>
-        </w:rPr>
-        <w:t>feature</w:t>
-      </w:r>
-      <w:proofErr w:type="spellEnd"/>
-      <w:r>
-        <w:rPr>
-          <w:rFonts w:ascii="Arial" w:hAnsi="Arial" w:cs="Arial"/>
-          <w:lang w:eastAsia="es-EC"/>
-        </w:rPr>
-        <w:t>/</w:t>
-      </w:r>
-      <w:proofErr w:type="spellStart"/>
-      <w:r>
-        <w:rPr>
-          <w:rFonts w:ascii="Arial" w:hAnsi="Arial" w:cs="Arial"/>
-          <w:lang w:eastAsia="es-EC"/>
-        </w:rPr>
-        <w:t>maquetacion-html</w:t>
-      </w:r>
-      <w:proofErr w:type="spellEnd"/>
-      <w:r>
-        <w:rPr>
-          <w:rFonts w:ascii="Arial" w:hAnsi="Arial" w:cs="Arial"/>
-          <w:lang w:eastAsia="es-EC"/>
-        </w:rPr>
-        <w:t>”</w:t>
+        <w:t>CREACION DE LA RAMA “feature/maquetacion-html”</w:t>
       </w:r>
     </w:p>
     <w:p>
@@ -3054,7 +2704,7 @@
                     <pic:cNvPicPr/>
                   </pic:nvPicPr>
                   <pic:blipFill>
-                    <a:blip r:embed="rId27">
+                    <a:blip r:embed="rId28">
                       <a:extLst>
                         <a:ext uri="{28A0092B-C50C-407E-A947-70E740481C1C}">
                           <a14:useLocalDpi xmlns:a14="http://schemas.microsoft.com/office/drawing/2010/main" val="0"/>
@@ -3203,6 +2853,7 @@
       <w:r>
         <w:rPr>
           <w:rFonts w:ascii="Arial" w:hAnsi="Arial" w:cs="Arial"/>
+          <w:noProof/>
         </w:rPr>
         <w:drawing>
           <wp:inline distT="0" distB="0" distL="0" distR="0" wp14:anchorId="53259257" wp14:editId="3E0D7B53">
@@ -3220,7 +2871,7 @@
                     <pic:cNvPicPr/>
                   </pic:nvPicPr>
                   <pic:blipFill>
-                    <a:blip r:embed="rId28"/>
+                    <a:blip r:embed="rId29"/>
                     <a:stretch>
                       <a:fillRect/>
                     </a:stretch>
@@ -3447,7 +3098,6 @@
           <w:bCs/>
           <w:lang w:eastAsia="es-EC"/>
         </w:rPr>
-        <w:lastRenderedPageBreak/>
         <w:t>REALIZAMOS EL COMIT PARA SUBIR LOS CAMBIOS A GITHUB</w:t>
       </w:r>
     </w:p>
@@ -3562,6 +3212,7 @@
           <w:rFonts w:ascii="Arial" w:eastAsiaTheme="majorEastAsia" w:hAnsi="Arial" w:cs="Arial"/>
           <w:b/>
           <w:bCs/>
+          <w:noProof/>
           <w:color w:val="2F5496" w:themeColor="accent1" w:themeShade="BF"/>
           <w:lang w:val="es-ES" w:eastAsia="es-EC"/>
         </w:rPr>
@@ -3581,7 +3232,7 @@
                     <pic:cNvPicPr/>
                   </pic:nvPicPr>
                   <pic:blipFill>
-                    <a:blip r:embed="rId29"/>
+                    <a:blip r:embed="rId30"/>
                     <a:stretch>
                       <a:fillRect/>
                     </a:stretch>
@@ -3665,23 +3316,7 @@
           <w:rFonts w:ascii="Arial" w:hAnsi="Arial" w:cs="Arial"/>
           <w:lang w:val="en-US"/>
         </w:rPr>
-        <w:t xml:space="preserve">Gamma, E., Helm, R., Johnson, R., &amp; </w:t>
-      </w:r>
-      <w:proofErr w:type="spellStart"/>
-      <w:r>
-        <w:rPr>
-          <w:rFonts w:ascii="Arial" w:hAnsi="Arial" w:cs="Arial"/>
-          <w:lang w:val="en-US"/>
-        </w:rPr>
-        <w:t>Vlissides</w:t>
-      </w:r>
-      <w:proofErr w:type="spellEnd"/>
-      <w:r>
-        <w:rPr>
-          <w:rFonts w:ascii="Arial" w:hAnsi="Arial" w:cs="Arial"/>
-          <w:lang w:val="en-US"/>
-        </w:rPr>
-        <w:t xml:space="preserve">, J. (1994). Design patterns: </w:t>
+        <w:t xml:space="preserve">Gamma, E., Helm, R., Johnson, R., &amp; Vlissides, J. (1994). Design patterns: </w:t>
       </w:r>
       <w:r>
         <w:rPr>
@@ -3873,7 +3508,7 @@
       </w:pPr>
     </w:p>
     <w:sectPr>
-      <w:headerReference w:type="first" r:id="rId30"/>
+      <w:headerReference w:type="first" r:id="rId31"/>
       <w:pgSz w:w="11906" w:h="16838"/>
       <w:pgMar w:top="1417" w:right="1701" w:bottom="1417" w:left="1701" w:header="708" w:footer="708" w:gutter="0"/>
       <w:pgNumType w:start="1"/>
@@ -4749,7 +4384,7 @@
         <v:path o:extrusionok="f" gradientshapeok="t" o:connecttype="rect"/>
         <o:lock v:ext="edit" aspectratio="t"/>
       </v:shapetype>
-      <v:shape id="_x0000_i1062" type="#_x0000_t75" style="width:11.85pt;height:11.85pt" o:bullet="t">
+      <v:shape id="_x0000_i1106" type="#_x0000_t75" style="width:11.85pt;height:11.85pt" o:bullet="t">
         <v:imagedata r:id="rId1" o:title="mso3E28"/>
       </v:shape>
     </w:pict>

</xml_diff>